<commit_message>
Adding description of network router and NIC name requirements for connecting to XSight
</commit_message>
<xml_diff>
--- a/TR-017_System_Tuning.docx
+++ b/TR-017_System_Tuning.docx
@@ -1,6 +1,6 @@
 
 <file path=word/document.xml><?xml version="1.0" encoding="utf-8"?>
-<w:document xmlns:wpc="http://schemas.microsoft.com/office/word/2010/wordprocessingCanvas" xmlns:cx="http://schemas.microsoft.com/office/drawing/2014/chartex" xmlns:cx1="http://schemas.microsoft.com/office/drawing/2015/9/8/chartex" xmlns:cx2="http://schemas.microsoft.com/office/drawing/2015/10/21/chartex" xmlns:cx3="http://schemas.microsoft.com/office/drawing/2016/5/9/chartex" xmlns:cx4="http://schemas.microsoft.com/office/drawing/2016/5/10/chartex" xmlns:cx5="http://schemas.microsoft.com/office/drawing/2016/5/11/chartex" xmlns:cx6="http://schemas.microsoft.com/office/drawing/2016/5/12/chartex" xmlns:cx7="http://schemas.microsoft.com/office/drawing/2016/5/13/chartex" xmlns:cx8="http://schemas.microsoft.com/office/drawing/2016/5/14/chartex" xmlns:mc="http://schemas.openxmlformats.org/markup-compatibility/2006" xmlns:aink="http://schemas.microsoft.com/office/drawing/2016/ink" xmlns:am3d="http://schemas.microsoft.com/office/drawing/2017/model3d" xmlns:o="urn:schemas-microsoft-com:office:office" xmlns:oel="http://schemas.microsoft.com/office/2019/extlst" xmlns:r="http://schemas.openxmlformats.org/officeDocument/2006/relationships" xmlns:m="http://schemas.openxmlformats.org/officeDocument/2006/math" xmlns:v="urn:schemas-microsoft-com:vml" xmlns:wp14="http://schemas.microsoft.com/office/word/2010/wordprocessingDrawing" xmlns:wp="http://schemas.openxmlformats.org/drawingml/2006/wordprocessingDrawing" xmlns:w10="urn:schemas-microsoft-com:office:word" xmlns:w="http://schemas.openxmlformats.org/wordprocessingml/2006/main" xmlns:w14="http://schemas.microsoft.com/office/word/2010/wordml" xmlns:w15="http://schemas.microsoft.com/office/word/2012/wordml" xmlns:w16cei="http://schemas.microsoft.com/office/word/2026/wordml/cei" xmlns:w16cex="http://schemas.microsoft.com/office/word/2018/wordml/cex" xmlns:w16cid="http://schemas.microsoft.com/office/word/2016/wordml/cid" xmlns:w16="http://schemas.microsoft.com/office/word/2018/wordml" xmlns:w16du="http://schemas.microsoft.com/office/word/2023/wordml/word16du" xmlns:w16sdtdh="http://schemas.microsoft.com/office/word/2020/wordml/sdtdatahash" xmlns:w16sdtfl="http://schemas.microsoft.com/office/word/2024/wordml/sdtformatlock" xmlns:w16se="http://schemas.microsoft.com/office/word/2015/wordml/symex" xmlns:wpg="http://schemas.microsoft.com/office/word/2010/wordprocessingGroup" xmlns:wpi="http://schemas.microsoft.com/office/word/2010/wordprocessingInk" xmlns:wne="http://schemas.microsoft.com/office/word/2006/wordml" xmlns:wps="http://schemas.microsoft.com/office/word/2010/wordprocessingShape" mc:Ignorable="w14 w15 w16se w16cid w16 w16cex w16sdtdh w16sdtfl w16du wp14">
+<w:document xmlns:wpc="http://schemas.microsoft.com/office/word/2010/wordprocessingCanvas" xmlns:cx="http://schemas.microsoft.com/office/drawing/2014/chartex" xmlns:cx1="http://schemas.microsoft.com/office/drawing/2015/9/8/chartex" xmlns:cx2="http://schemas.microsoft.com/office/drawing/2015/10/21/chartex" xmlns:cx3="http://schemas.microsoft.com/office/drawing/2016/5/9/chartex" xmlns:cx4="http://schemas.microsoft.com/office/drawing/2016/5/10/chartex" xmlns:cx5="http://schemas.microsoft.com/office/drawing/2016/5/11/chartex" xmlns:cx6="http://schemas.microsoft.com/office/drawing/2016/5/12/chartex" xmlns:cx7="http://schemas.microsoft.com/office/drawing/2016/5/13/chartex" xmlns:cx8="http://schemas.microsoft.com/office/drawing/2016/5/14/chartex" xmlns:mc="http://schemas.openxmlformats.org/markup-compatibility/2006" xmlns:aink="http://schemas.microsoft.com/office/drawing/2016/ink" xmlns:am3d="http://schemas.microsoft.com/office/drawing/2017/model3d" xmlns:o="urn:schemas-microsoft-com:office:office" xmlns:oel="http://schemas.microsoft.com/office/2019/extlst" xmlns:r="http://schemas.openxmlformats.org/officeDocument/2006/relationships" xmlns:m="http://schemas.openxmlformats.org/officeDocument/2006/math" xmlns:v="urn:schemas-microsoft-com:vml" xmlns:wp14="http://schemas.microsoft.com/office/word/2010/wordprocessingDrawing" xmlns:wp="http://schemas.openxmlformats.org/drawingml/2006/wordprocessingDrawing" xmlns:w10="urn:schemas-microsoft-com:office:word" xmlns:w="http://schemas.openxmlformats.org/wordprocessingml/2006/main" xmlns:w14="http://schemas.microsoft.com/office/word/2010/wordml" xmlns:w15="http://schemas.microsoft.com/office/word/2012/wordml" xmlns:w16cex="http://schemas.microsoft.com/office/word/2018/wordml/cex" xmlns:w16cid="http://schemas.microsoft.com/office/word/2016/wordml/cid" xmlns:w16="http://schemas.microsoft.com/office/word/2018/wordml" xmlns:w16du="http://schemas.microsoft.com/office/word/2023/wordml/word16du" xmlns:w16sdtdh="http://schemas.microsoft.com/office/word/2020/wordml/sdtdatahash" xmlns:w16sdtfl="http://schemas.microsoft.com/office/word/2024/wordml/sdtformatlock" xmlns:w16se="http://schemas.microsoft.com/office/word/2015/wordml/symex" xmlns:wpg="http://schemas.microsoft.com/office/word/2010/wordprocessingGroup" xmlns:wpi="http://schemas.microsoft.com/office/word/2010/wordprocessingInk" xmlns:wne="http://schemas.microsoft.com/office/word/2006/wordml" xmlns:wps="http://schemas.microsoft.com/office/word/2010/wordprocessingShape" mc:Ignorable="w14 w15 w16se w16cid w16 w16cex w16sdtdh w16sdtfl w16du wp14">
   <w:body>
     <w:p>
       <w:pPr>
@@ -224,19 +224,13 @@
         <w:t xml:space="preserve"> It is also capable of doing depth estimation on a 25-camera system, but the speed of this is still being studied. Using these drives, it can store from a 21-camera live system at full rate until the drives are approximately halfway full; we’re still investigating the use of commercial-grade drives to enable full-speed storage to full drive capacity.</w:t>
       </w:r>
       <w:r>
-        <w:t xml:space="preserve"> Using an </w:t>
-      </w:r>
-      <w:r>
-        <w:t>ATTO Technology ThunderLink NS 5102</w:t>
+        <w:t xml:space="preserve"> Using an ATTO Technology ThunderLink NS 5102</w:t>
       </w:r>
       <w:r>
         <w:t xml:space="preserve"> </w:t>
       </w:r>
       <w:r>
-        <w:t>Thunderbolt 5 to 100Gb Ethernet Adapter</w:t>
-      </w:r>
-      <w:r>
-        <w:t xml:space="preserve">, the system </w:t>
+        <w:t xml:space="preserve">Thunderbolt 5 to 100Gb Ethernet Adapter, the system </w:t>
       </w:r>
       <w:r>
         <w:t>can</w:t>
@@ -1533,6 +1527,18 @@
           <w:b/>
           <w:bCs/>
         </w:rPr>
+        <w:t>Attached router:</w:t>
+      </w:r>
+      <w:r>
+        <w:t xml:space="preserve"> When using an XSight display that sends multicast packets to the Render Server, the receiving Ubuntu server must be attached to a router. That router does not need to be connected to anything else (or to the Internet), but having it provides multicast support that enables the host to then receive multicast packets on all its NICs. For some configurations, the NIC address 0.0.0.0 must be used rather than the address of the NIC receiving packets.</w:t>
+      </w:r>
+    </w:p>
+    <w:p>
+      <w:r>
+        <w:rPr>
+          <w:b/>
+          <w:bCs/>
+        </w:rPr>
         <w:t>Cabling and reboot:</w:t>
       </w:r>
       <w:r>
@@ -1751,6 +1757,7 @@
         </w:numPr>
       </w:pPr>
       <w:r>
+        <w:lastRenderedPageBreak/>
         <w:t xml:space="preserve">In </w:t>
       </w:r>
       <w:r>
@@ -1910,7 +1917,6 @@
         </w:numPr>
       </w:pPr>
       <w:r>
-        <w:lastRenderedPageBreak/>
         <w:t xml:space="preserve">(Fixed in the more recent adapter driver available in April 2025.) </w:t>
       </w:r>
       <w:r>
@@ -2409,6 +2415,7 @@
           <w:b/>
           <w:bCs/>
         </w:rPr>
+        <w:lastRenderedPageBreak/>
         <w:t>Mellanox tuning:</w:t>
       </w:r>
       <w:r>
@@ -2460,401 +2467,476 @@
         <w:t xml:space="preserve"> this command to configure HIGH_THROUGHPUT </w:t>
       </w:r>
       <w:r>
-        <w:t xml:space="preserve">on all systems </w:t>
-      </w:r>
-      <w:r>
+        <w:t xml:space="preserve">on all systems where we were able </w:t>
+      </w:r>
+      <w:r>
+        <w:t xml:space="preserve">to get full-rate </w:t>
+      </w:r>
+      <w:r>
+        <w:t>receiving</w:t>
+      </w:r>
+      <w:r>
+        <w:t xml:space="preserve"> to work reliably: </w:t>
+      </w:r>
+      <w:r>
+        <w:rPr>
+          <w:b/>
+          <w:bCs/>
+          <w:i/>
+          <w:iCs/>
+        </w:rPr>
+        <w:t>sudo python3 mlnx_tune -p HIGH_THROUGHPUT</w:t>
+      </w:r>
+      <w:r>
+        <w:t xml:space="preserve"> </w:t>
+      </w:r>
+      <w:r>
+        <w:t xml:space="preserve">so </w:t>
+      </w:r>
+      <w:r>
+        <w:t xml:space="preserve">it </w:t>
+      </w:r>
+      <w:r>
+        <w:t xml:space="preserve">may </w:t>
+      </w:r>
+      <w:r>
+        <w:t xml:space="preserve">be </w:t>
+      </w:r>
+      <w:r>
+        <w:t xml:space="preserve">required </w:t>
+      </w:r>
+      <w:r>
+        <w:t xml:space="preserve">once on each system and then </w:t>
+      </w:r>
+      <w:r>
+        <w:t>the system rebooted</w:t>
+      </w:r>
+      <w:r>
+        <w:t>.</w:t>
+      </w:r>
+    </w:p>
+    <w:p>
+      <w:r>
+        <w:rPr>
+          <w:b/>
+          <w:bCs/>
+        </w:rPr>
+        <w:t>Global receive buffer size:</w:t>
+      </w:r>
+      <w:r>
+        <w:t xml:space="preserve"> There is a system-wide number of available buffers. Using </w:t>
+      </w:r>
+      <w:r>
+        <w:rPr>
+          <w:b/>
+          <w:bCs/>
+          <w:i/>
+          <w:iCs/>
+        </w:rPr>
+        <w:t>sudo s</w:t>
+      </w:r>
+      <w:r>
+        <w:rPr>
+          <w:b/>
+          <w:bCs/>
+          <w:i/>
+          <w:iCs/>
+        </w:rPr>
+        <w:t>ysctl -w net.core.rmem_max=26214400</w:t>
+      </w:r>
+      <w:r>
+        <w:t xml:space="preserve"> (25MB) on the client enabled 25-camera (5 sending threads) operation at 125fps for 180 seconds without dropped packets.</w:t>
+      </w:r>
+    </w:p>
+    <w:p>
+      <w:pPr>
+        <w:rPr>
+          <w:b/>
+          <w:bCs/>
+          <w:i/>
+          <w:iCs/>
+        </w:rPr>
+      </w:pPr>
+      <w:r>
+        <w:rPr>
+          <w:b/>
+          <w:bCs/>
+        </w:rPr>
+        <w:t>Global UDP buffer pool size:</w:t>
+      </w:r>
+      <w:r>
+        <w:t xml:space="preserve"> There is also an operating-specified limit on the total number of pages available for UDP buffers. On Linux, the net.ipv4.udp_mem (readable via </w:t>
+      </w:r>
+      <w:r>
+        <w:rPr>
+          <w:i/>
+          <w:iCs/>
+        </w:rPr>
+        <w:t>/proc/sys/net/ipv4/udp_mem</w:t>
+      </w:r>
+      <w:r>
+        <w:t xml:space="preserve">) sets the number of 4K blocks available system wide. This can be adjusted using </w:t>
+      </w:r>
+      <w:r>
+        <w:rPr>
+          <w:i/>
+          <w:iCs/>
+        </w:rPr>
+        <w:t>sysctl</w:t>
+      </w:r>
+      <w:r>
+        <w:t xml:space="preserve"> and is set by default based on the total RAM size at boot time. When reaching 125fps without dropped packets, this was set on Linux using: </w:t>
+      </w:r>
+      <w:r>
+        <w:rPr>
+          <w:b/>
+          <w:bCs/>
+          <w:i/>
+          <w:iCs/>
+        </w:rPr>
+        <w:t>sudo sysctl -w net.ipv4.udp_mem=4000000</w:t>
+      </w:r>
+    </w:p>
+    <w:p>
+      <w:r>
+        <w:rPr>
+          <w:b/>
+          <w:bCs/>
+        </w:rPr>
+        <w:t>Global max backlog:</w:t>
+      </w:r>
+      <w:r>
+        <w:t xml:space="preserve"> This was not needed to achieve full throughput in our systems, but it is recommended for high-throughput systems:</w:t>
+      </w:r>
+      <w:r>
+        <w:t xml:space="preserve"> </w:t>
+      </w:r>
+      <w:r>
+        <w:rPr>
+          <w:b/>
+          <w:bCs/>
+          <w:i/>
+          <w:iCs/>
+        </w:rPr>
+        <w:t>sysctl -w net.core.netdev_max_backlog=</w:t>
+      </w:r>
+      <w:r>
+        <w:rPr>
+          <w:b/>
+          <w:bCs/>
+          <w:i/>
+          <w:iCs/>
+        </w:rPr>
+        <w:t>3</w:t>
+      </w:r>
+      <w:r>
+        <w:rPr>
+          <w:b/>
+          <w:bCs/>
+          <w:i/>
+          <w:iCs/>
+        </w:rPr>
+        <w:t>000</w:t>
+      </w:r>
+      <w:r>
+        <w:t xml:space="preserve"> </w:t>
+      </w:r>
+      <w:r>
+        <w:t xml:space="preserve">or to make it permanent: </w:t>
+      </w:r>
+      <w:r>
+        <w:rPr>
+          <w:b/>
+          <w:bCs/>
+          <w:i/>
+          <w:iCs/>
+        </w:rPr>
+        <w:t>echo ‘</w:t>
+      </w:r>
+      <w:r>
+        <w:rPr>
+          <w:b/>
+          <w:bCs/>
+          <w:i/>
+          <w:iCs/>
+        </w:rPr>
+        <w:t>net.core.netdev_max_backlog = 3000’ &gt;&gt; /etc/sysctl.conf</w:t>
+      </w:r>
+      <w:r>
+        <w:t xml:space="preserve"> (</w:t>
+      </w:r>
+      <w:r>
+        <w:t>one site recommends</w:t>
+      </w:r>
+      <w:r>
+        <w:t xml:space="preserve"> </w:t>
+      </w:r>
+      <w:r>
+        <w:t>setting it to 30000 from its default value of 1000; other sites recommend setting it to 2000).</w:t>
+      </w:r>
+      <w:r>
+        <w:t xml:space="preserve"> </w:t>
+      </w:r>
+    </w:p>
+    <w:p>
+      <w:r>
+        <w:rPr>
+          <w:b/>
+          <w:bCs/>
+        </w:rPr>
+        <w:t>UDP socket read buffer size:</w:t>
+      </w:r>
+      <w:r>
+        <w:t xml:space="preserve"> There is a pre-specified buffer for incoming data on each UDP socket, which can cause overflow when the client does not read fast enough to pull every packet before the next one arrives. This buffer size can be set using the </w:t>
+      </w:r>
+      <w:r>
+        <w:rPr>
+          <w:i/>
+          <w:iCs/>
+        </w:rPr>
+        <w:t>SO_RECVBUF</w:t>
+      </w:r>
+      <w:r>
+        <w:t xml:space="preserve"> socket option </w:t>
+      </w:r>
+      <w:r>
+        <w:t xml:space="preserve">using </w:t>
+      </w:r>
+      <w:r>
+        <w:rPr>
+          <w:i/>
+          <w:iCs/>
+        </w:rPr>
+        <w:t>setsockopt()</w:t>
+      </w:r>
+      <w:r>
+        <w:t>. Setting it to be large enough to handle multiple incoming packets enables the system to be robust to longer periods between socket servicing.</w:t>
+      </w:r>
+    </w:p>
+    <w:p>
+      <w:r>
+        <w:rPr>
+          <w:b/>
+          <w:bCs/>
+        </w:rPr>
+        <w:t>UDP socket send buffer size:</w:t>
+      </w:r>
+      <w:r>
+        <w:t xml:space="preserve"> Controlled by </w:t>
+      </w:r>
+      <w:r>
+        <w:rPr>
+          <w:i/>
+          <w:iCs/>
+        </w:rPr>
+        <w:t>SO_SNDBUF</w:t>
+      </w:r>
+      <w:r>
+        <w:t xml:space="preserve"> option in </w:t>
+      </w:r>
+      <w:r>
+        <w:rPr>
+          <w:i/>
+          <w:iCs/>
+        </w:rPr>
+        <w:t>setsockopt()</w:t>
+      </w:r>
+      <w:r>
+        <w:t>.</w:t>
+      </w:r>
+      <w:r>
+        <w:t xml:space="preserve"> This avoids packets being dropped before they are sent because the thread queues up a second one before the first has been transmitted.</w:t>
+      </w:r>
+    </w:p>
+    <w:p>
+      <w:r>
+        <w:rPr>
+          <w:b/>
+          <w:bCs/>
+        </w:rPr>
+        <w:t>Interrupt coalescence:</w:t>
+      </w:r>
+      <w:r>
+        <w:t xml:space="preserve"> </w:t>
+      </w:r>
+      <w:r>
+        <w:t xml:space="preserve">The </w:t>
+      </w:r>
+      <w:r>
+        <w:rPr>
+          <w:b/>
+          <w:bCs/>
+          <w:i/>
+          <w:iCs/>
+        </w:rPr>
+        <w:t>ethtool</w:t>
+      </w:r>
+      <w:r>
+        <w:t xml:space="preserve"> command can be used to adjust the maximum time to wait and the maximum number of buffers to fill before generating an interrupt. When tested across a range of rx-usecs (8, 32, 128, 256) and a range of rx-frames (16, 64, 128) there was not much difference in an application that was seeing a few lost frames on some cameras. The initial setting of 32, 64 was as good or better than the others in at least one of the two sweeps made of the parameters. It is likely that the Mellanox tuning set these parameters for high throughput when it was run.</w:t>
+      </w:r>
+      <w:r>
+        <w:t xml:space="preserve"> The </w:t>
+      </w:r>
+      <w:r>
+        <w:rPr>
+          <w:b/>
+          <w:bCs/>
+          <w:i/>
+          <w:iCs/>
+        </w:rPr>
+        <w:t>check_coalescing.sh</w:t>
+      </w:r>
+      <w:r>
+        <w:t xml:space="preserve"> script in the </w:t>
+      </w:r>
+      <w:r>
+        <w:rPr>
+          <w:i/>
+          <w:iCs/>
+        </w:rPr>
+        <w:t>ASDP_Core_API</w:t>
+      </w:r>
+      <w:r>
+        <w:t xml:space="preserve"> library can be used to re-test this if needed.</w:t>
+      </w:r>
+    </w:p>
+    <w:p>
+      <w:r>
+        <w:rPr>
+          <w:b/>
+          <w:bCs/>
+        </w:rPr>
+        <w:t>Open Fabric:</w:t>
+      </w:r>
+      <w:r>
+        <w:t xml:space="preserve"> NVidia has a set of “open fabric” drivers that can provide a unified address space among 100GigE-connected hosts and their GPUs that handles virtual memory among all devices. If needed, this could be used for transferring data from the Storage Server to the Render Server.</w:t>
+      </w:r>
+      <w:r>
+        <w:rPr>
+          <w:rStyle w:val="FootnoteReference"/>
+        </w:rPr>
+        <w:footnoteReference w:id="9"/>
+      </w:r>
+    </w:p>
+    <w:p>
+      <w:r>
+        <w:rPr>
+          <w:b/>
+          <w:bCs/>
+        </w:rPr>
+        <w:t>network_tuning.sh:</w:t>
+      </w:r>
+      <w:r>
+        <w:t xml:space="preserve"> This script lives in the ASDP_Core_API directory. It can be copied into /usr/local/bin and made executable and then add the following to the file /etc/system/system/network_tuning.service</w:t>
+      </w:r>
+      <w:r>
+        <w:t xml:space="preserve"> and then run </w:t>
+      </w:r>
+      <w:r>
+        <w:rPr>
+          <w:b/>
+          <w:bCs/>
+          <w:i/>
+          <w:iCs/>
+        </w:rPr>
+        <w:t>sudo systemctl daemon-reload</w:t>
+      </w:r>
+      <w:r>
+        <w:t xml:space="preserve"> and</w:t>
+      </w:r>
+      <w:r>
+        <w:rPr>
+          <w:b/>
+          <w:bCs/>
+          <w:i/>
+          <w:iCs/>
+        </w:rPr>
+        <w:t xml:space="preserve"> sudo systemctl enable my-startup.service</w:t>
+      </w:r>
+      <w:r>
+        <w:t xml:space="preserve"> </w:t>
+      </w:r>
+      <w:r>
+        <w:t>:</w:t>
+      </w:r>
+    </w:p>
+    <w:p>
+      <w:pPr>
+        <w:spacing w:after="0" w:line="240" w:lineRule="auto"/>
+        <w:rPr>
+          <w:rFonts w:ascii="Courier New" w:hAnsi="Courier New" w:cs="Courier New"/>
+        </w:rPr>
+      </w:pPr>
+      <w:r>
+        <w:rPr>
+          <w:rFonts w:ascii="Courier New" w:hAnsi="Courier New" w:cs="Courier New"/>
+        </w:rPr>
+        <w:t>[Unit]</w:t>
+      </w:r>
+    </w:p>
+    <w:p>
+      <w:pPr>
+        <w:spacing w:after="0" w:line="240" w:lineRule="auto"/>
+        <w:rPr>
+          <w:rFonts w:ascii="Courier New" w:hAnsi="Courier New" w:cs="Courier New"/>
+        </w:rPr>
+      </w:pPr>
+      <w:r>
+        <w:rPr>
+          <w:rFonts w:ascii="Courier New" w:hAnsi="Courier New" w:cs="Courier New"/>
+        </w:rPr>
+        <w:t>Description=ASDP Network Tuning</w:t>
+      </w:r>
+    </w:p>
+    <w:p>
+      <w:pPr>
+        <w:spacing w:after="0" w:line="240" w:lineRule="auto"/>
+        <w:rPr>
+          <w:rFonts w:ascii="Courier New" w:hAnsi="Courier New" w:cs="Courier New"/>
+        </w:rPr>
+      </w:pPr>
+      <w:r>
+        <w:rPr>
+          <w:rFonts w:ascii="Courier New" w:hAnsi="Courier New" w:cs="Courier New"/>
+        </w:rPr>
+        <w:t>Wants=network.target</w:t>
+      </w:r>
+    </w:p>
+    <w:p>
+      <w:pPr>
+        <w:spacing w:after="0" w:line="240" w:lineRule="auto"/>
+        <w:rPr>
+          <w:rFonts w:ascii="Courier New" w:hAnsi="Courier New" w:cs="Courier New"/>
+        </w:rPr>
+      </w:pPr>
+      <w:r>
+        <w:rPr>
+          <w:rFonts w:ascii="Courier New" w:hAnsi="Courier New" w:cs="Courier New"/>
+        </w:rPr>
+        <w:t>After=network.target</w:t>
+      </w:r>
+    </w:p>
+    <w:p>
+      <w:pPr>
+        <w:spacing w:after="0" w:line="240" w:lineRule="auto"/>
+        <w:rPr>
+          <w:rFonts w:ascii="Courier New" w:hAnsi="Courier New" w:cs="Courier New"/>
+        </w:rPr>
+      </w:pPr>
+    </w:p>
+    <w:p>
+      <w:pPr>
+        <w:spacing w:after="0" w:line="240" w:lineRule="auto"/>
+        <w:rPr>
+          <w:rFonts w:ascii="Courier New" w:hAnsi="Courier New" w:cs="Courier New"/>
+        </w:rPr>
+      </w:pPr>
+      <w:r>
+        <w:rPr>
+          <w:rFonts w:ascii="Courier New" w:hAnsi="Courier New" w:cs="Courier New"/>
+        </w:rPr>
         <w:lastRenderedPageBreak/>
-        <w:t xml:space="preserve">where we were able </w:t>
-      </w:r>
-      <w:r>
-        <w:t xml:space="preserve">to get full-rate </w:t>
-      </w:r>
-      <w:r>
-        <w:t>receiving</w:t>
-      </w:r>
-      <w:r>
-        <w:t xml:space="preserve"> to work reliably: </w:t>
-      </w:r>
-      <w:r>
-        <w:rPr>
-          <w:b/>
-          <w:bCs/>
-          <w:i/>
-          <w:iCs/>
-        </w:rPr>
-        <w:t>sudo python3 mlnx_tune -p HIGH_THROUGHPUT</w:t>
-      </w:r>
-      <w:r>
-        <w:t xml:space="preserve"> </w:t>
-      </w:r>
-      <w:r>
-        <w:t xml:space="preserve">so </w:t>
-      </w:r>
-      <w:r>
-        <w:t xml:space="preserve">it </w:t>
-      </w:r>
-      <w:r>
-        <w:t xml:space="preserve">may </w:t>
-      </w:r>
-      <w:r>
-        <w:t xml:space="preserve">be </w:t>
-      </w:r>
-      <w:r>
-        <w:t xml:space="preserve">required </w:t>
-      </w:r>
-      <w:r>
-        <w:t xml:space="preserve">once on each system and then </w:t>
-      </w:r>
-      <w:r>
-        <w:t>the system rebooted</w:t>
-      </w:r>
-      <w:r>
-        <w:t>.</w:t>
-      </w:r>
-    </w:p>
-    <w:p>
-      <w:r>
-        <w:rPr>
-          <w:b/>
-          <w:bCs/>
-        </w:rPr>
-        <w:t>Global receive buffer size:</w:t>
-      </w:r>
-      <w:r>
-        <w:t xml:space="preserve"> There is a system-wide number of available buffers. Using </w:t>
-      </w:r>
-      <w:r>
-        <w:rPr>
-          <w:b/>
-          <w:bCs/>
-          <w:i/>
-          <w:iCs/>
-        </w:rPr>
-        <w:t>sudo s</w:t>
-      </w:r>
-      <w:r>
-        <w:rPr>
-          <w:b/>
-          <w:bCs/>
-          <w:i/>
-          <w:iCs/>
-        </w:rPr>
-        <w:t>ysctl -w net.core.rmem_max=26214400</w:t>
-      </w:r>
-      <w:r>
-        <w:t xml:space="preserve"> (25MB) on the client enabled 25-camera (5 sending threads) operation at 125fps for 180 seconds without dropped packets.</w:t>
-      </w:r>
-    </w:p>
-    <w:p>
-      <w:pPr>
-        <w:rPr>
-          <w:b/>
-          <w:bCs/>
-          <w:i/>
-          <w:iCs/>
-        </w:rPr>
-      </w:pPr>
-      <w:r>
-        <w:rPr>
-          <w:b/>
-          <w:bCs/>
-        </w:rPr>
-        <w:t>Global UDP buffer pool size:</w:t>
-      </w:r>
-      <w:r>
-        <w:t xml:space="preserve"> There is also an operating-specified limit on the total number of pages available for UDP buffers. On Linux, the net.ipv4.udp_mem (readable via </w:t>
-      </w:r>
-      <w:r>
-        <w:rPr>
-          <w:i/>
-          <w:iCs/>
-        </w:rPr>
-        <w:t>/proc/sys/net/ipv4/udp_mem</w:t>
-      </w:r>
-      <w:r>
-        <w:t xml:space="preserve">) sets the number of 4K blocks available system wide. This can be adjusted using </w:t>
-      </w:r>
-      <w:r>
-        <w:rPr>
-          <w:i/>
-          <w:iCs/>
-        </w:rPr>
-        <w:t>sysctl</w:t>
-      </w:r>
-      <w:r>
-        <w:t xml:space="preserve"> and is set by default based on the total RAM size at boot time. When reaching 125fps without dropped packets, this was set on Linux using: </w:t>
-      </w:r>
-      <w:r>
-        <w:rPr>
-          <w:b/>
-          <w:bCs/>
-          <w:i/>
-          <w:iCs/>
-        </w:rPr>
-        <w:t>sudo sysctl -w net.ipv4.udp_mem=4000000</w:t>
-      </w:r>
-    </w:p>
-    <w:p>
-      <w:r>
-        <w:rPr>
-          <w:b/>
-          <w:bCs/>
-        </w:rPr>
-        <w:t>Global max backlog:</w:t>
-      </w:r>
-      <w:r>
-        <w:t xml:space="preserve"> This was not needed to achieve full throughput in our systems, but it is recommended for high-throughput systems:</w:t>
-      </w:r>
-      <w:r>
-        <w:t xml:space="preserve"> </w:t>
-      </w:r>
-      <w:r>
-        <w:rPr>
-          <w:b/>
-          <w:bCs/>
-          <w:i/>
-          <w:iCs/>
-        </w:rPr>
-        <w:t>sysctl -w net.core.netdev_max_backlog=</w:t>
-      </w:r>
-      <w:r>
-        <w:rPr>
-          <w:b/>
-          <w:bCs/>
-          <w:i/>
-          <w:iCs/>
-        </w:rPr>
-        <w:t>3</w:t>
-      </w:r>
-      <w:r>
-        <w:rPr>
-          <w:b/>
-          <w:bCs/>
-          <w:i/>
-          <w:iCs/>
-        </w:rPr>
-        <w:t>000</w:t>
-      </w:r>
-      <w:r>
-        <w:t xml:space="preserve"> </w:t>
-      </w:r>
-      <w:r>
-        <w:t xml:space="preserve">or to make it permanent: </w:t>
-      </w:r>
-      <w:r>
-        <w:rPr>
-          <w:b/>
-          <w:bCs/>
-          <w:i/>
-          <w:iCs/>
-        </w:rPr>
-        <w:t>echo ‘</w:t>
-      </w:r>
-      <w:r>
-        <w:rPr>
-          <w:b/>
-          <w:bCs/>
-          <w:i/>
-          <w:iCs/>
-        </w:rPr>
-        <w:t>net.core.netdev_max_backlog = 3000’ &gt;&gt; /etc/sysctl.conf</w:t>
-      </w:r>
-      <w:r>
-        <w:t xml:space="preserve"> (</w:t>
-      </w:r>
-      <w:r>
-        <w:t>one site recommends</w:t>
-      </w:r>
-      <w:r>
-        <w:t xml:space="preserve"> </w:t>
-      </w:r>
-      <w:r>
-        <w:t>setting it to 30000 from its default value of 1000; other sites recommend setting it to 2000).</w:t>
-      </w:r>
-      <w:r>
-        <w:t xml:space="preserve"> </w:t>
-      </w:r>
-    </w:p>
-    <w:p>
-      <w:r>
-        <w:rPr>
-          <w:b/>
-          <w:bCs/>
-        </w:rPr>
-        <w:t>UDP socket read buffer size:</w:t>
-      </w:r>
-      <w:r>
-        <w:t xml:space="preserve"> There is a pre-specified buffer for incoming data on each UDP socket, which can cause overflow when the client does not read fast enough to pull every packet before the next one arrives. This buffer size can be set using the </w:t>
-      </w:r>
-      <w:r>
-        <w:rPr>
-          <w:i/>
-          <w:iCs/>
-        </w:rPr>
-        <w:t>SO_RECVBUF</w:t>
-      </w:r>
-      <w:r>
-        <w:t xml:space="preserve"> socket option </w:t>
-      </w:r>
-      <w:r>
-        <w:t xml:space="preserve">using </w:t>
-      </w:r>
-      <w:r>
-        <w:rPr>
-          <w:i/>
-          <w:iCs/>
-        </w:rPr>
-        <w:t>setsockopt()</w:t>
-      </w:r>
-      <w:r>
-        <w:t>. Setting it to be large enough to handle multiple incoming packets enables the system to be robust to longer periods between socket servicing.</w:t>
-      </w:r>
-    </w:p>
-    <w:p>
-      <w:r>
-        <w:rPr>
-          <w:b/>
-          <w:bCs/>
-        </w:rPr>
-        <w:t>UDP socket send buffer size:</w:t>
-      </w:r>
-      <w:r>
-        <w:t xml:space="preserve"> Controlled by </w:t>
-      </w:r>
-      <w:r>
-        <w:rPr>
-          <w:i/>
-          <w:iCs/>
-        </w:rPr>
-        <w:t>SO_SNDBUF</w:t>
-      </w:r>
-      <w:r>
-        <w:t xml:space="preserve"> option in </w:t>
-      </w:r>
-      <w:r>
-        <w:rPr>
-          <w:i/>
-          <w:iCs/>
-        </w:rPr>
-        <w:t>setsockopt()</w:t>
-      </w:r>
-      <w:r>
-        <w:t>.</w:t>
-      </w:r>
-      <w:r>
-        <w:t xml:space="preserve"> This avoids packets being dropped before they are sent because the thread queues up a second one before the first has been transmitted.</w:t>
-      </w:r>
-    </w:p>
-    <w:p>
-      <w:r>
-        <w:rPr>
-          <w:b/>
-          <w:bCs/>
-        </w:rPr>
-        <w:t>Interrupt coalescence:</w:t>
-      </w:r>
-      <w:r>
-        <w:t xml:space="preserve"> </w:t>
-      </w:r>
-      <w:r>
-        <w:t xml:space="preserve">The </w:t>
-      </w:r>
-      <w:r>
-        <w:rPr>
-          <w:b/>
-          <w:bCs/>
-          <w:i/>
-          <w:iCs/>
-        </w:rPr>
-        <w:t>ethtool</w:t>
-      </w:r>
-      <w:r>
-        <w:t xml:space="preserve"> command can be used to adjust the maximum time to wait and the maximum number of buffers to fill before generating an interrupt. When tested across a range of rx-usecs (8, 32, 128, 256) and a range of rx-frames (16, 64, 128) there was not much difference in an application that was seeing a few lost frames on some cameras. The initial setting of 32, 64 was as good or better than the others in at least one of the two sweeps made of the parameters. It is likely that the Mellanox tuning set these parameters for high throughput when it was run.</w:t>
-      </w:r>
-      <w:r>
-        <w:t xml:space="preserve"> The </w:t>
-      </w:r>
-      <w:r>
-        <w:rPr>
-          <w:b/>
-          <w:bCs/>
-          <w:i/>
-          <w:iCs/>
-        </w:rPr>
-        <w:t>check_coalescing.sh</w:t>
-      </w:r>
-      <w:r>
-        <w:t xml:space="preserve"> script in the </w:t>
-      </w:r>
-      <w:r>
-        <w:rPr>
-          <w:i/>
-          <w:iCs/>
-        </w:rPr>
-        <w:t>ASDP_Core_API</w:t>
-      </w:r>
-      <w:r>
-        <w:t xml:space="preserve"> library can be used to re-test this if needed.</w:t>
-      </w:r>
-    </w:p>
-    <w:p>
-      <w:r>
-        <w:rPr>
-          <w:b/>
-          <w:bCs/>
-        </w:rPr>
-        <w:t>Open Fabric:</w:t>
-      </w:r>
-      <w:r>
-        <w:t xml:space="preserve"> NVidia has a set of “open fabric” drivers that can provide a unified address space among 100GigE-connected hosts and their GPUs that handles virtual memory among all devices. If needed, this could be used for transferring data from the Storage Server to the Render Server.</w:t>
-      </w:r>
-      <w:r>
-        <w:rPr>
-          <w:rStyle w:val="FootnoteReference"/>
-        </w:rPr>
-        <w:footnoteReference w:id="9"/>
-      </w:r>
-    </w:p>
-    <w:p>
-      <w:r>
-        <w:rPr>
-          <w:b/>
-          <w:bCs/>
-        </w:rPr>
-        <w:t>network_tuning.sh:</w:t>
-      </w:r>
-      <w:r>
-        <w:t xml:space="preserve"> This script lives in the ASDP_Core_API directory. It can be copied into /usr/local/bin and made executable and then add the following to the file /etc/system/system/network_tuning.service</w:t>
-      </w:r>
-      <w:r>
-        <w:t xml:space="preserve"> and then run </w:t>
-      </w:r>
-      <w:r>
-        <w:rPr>
-          <w:b/>
-          <w:bCs/>
-          <w:i/>
-          <w:iCs/>
-        </w:rPr>
-        <w:t>sudo systemctl daemon-reload</w:t>
-      </w:r>
-      <w:r>
-        <w:t xml:space="preserve"> and</w:t>
-      </w:r>
-      <w:r>
-        <w:rPr>
-          <w:b/>
-          <w:bCs/>
-          <w:i/>
-          <w:iCs/>
-        </w:rPr>
-        <w:t xml:space="preserve"> sudo systemctl enable my-startup.service</w:t>
-      </w:r>
-      <w:r>
-        <w:t xml:space="preserve"> </w:t>
-      </w:r>
-      <w:r>
-        <w:t>:</w:t>
+        <w:t>[Service]</w:t>
       </w:r>
     </w:p>
     <w:p>
@@ -2868,7 +2950,7 @@
         <w:rPr>
           <w:rFonts w:ascii="Courier New" w:hAnsi="Courier New" w:cs="Courier New"/>
         </w:rPr>
-        <w:t>[Unit]</w:t>
+        <w:t>ExecStart=/usr/local/bin/network_tuning.sh</w:t>
       </w:r>
     </w:p>
     <w:p>
@@ -2882,7 +2964,7 @@
         <w:rPr>
           <w:rFonts w:ascii="Courier New" w:hAnsi="Courier New" w:cs="Courier New"/>
         </w:rPr>
-        <w:t>Description=ASDP Network Tuning</w:t>
+        <w:t>Type=oneshot</w:t>
       </w:r>
     </w:p>
     <w:p>
@@ -2896,7 +2978,7 @@
         <w:rPr>
           <w:rFonts w:ascii="Courier New" w:hAnsi="Courier New" w:cs="Courier New"/>
         </w:rPr>
-        <w:t>Wants=network.target</w:t>
+        <w:t>RemainAfterExit=yes</w:t>
       </w:r>
     </w:p>
     <w:p>
@@ -2906,11 +2988,19 @@
           <w:rFonts w:ascii="Courier New" w:hAnsi="Courier New" w:cs="Courier New"/>
         </w:rPr>
       </w:pPr>
-      <w:r>
+    </w:p>
+    <w:p>
+      <w:pPr>
+        <w:spacing w:after="0" w:line="240" w:lineRule="auto"/>
         <w:rPr>
           <w:rFonts w:ascii="Courier New" w:hAnsi="Courier New" w:cs="Courier New"/>
         </w:rPr>
-        <w:t>After=network.target</w:t>
+      </w:pPr>
+      <w:r>
+        <w:rPr>
+          <w:rFonts w:ascii="Courier New" w:hAnsi="Courier New" w:cs="Courier New"/>
+        </w:rPr>
+        <w:t>[Install]</w:t>
       </w:r>
     </w:p>
     <w:p>
@@ -2920,97 +3010,10 @@
           <w:rFonts w:ascii="Courier New" w:hAnsi="Courier New" w:cs="Courier New"/>
         </w:rPr>
       </w:pPr>
-    </w:p>
-    <w:p>
-      <w:pPr>
-        <w:spacing w:after="0" w:line="240" w:lineRule="auto"/>
+      <w:r>
         <w:rPr>
           <w:rFonts w:ascii="Courier New" w:hAnsi="Courier New" w:cs="Courier New"/>
         </w:rPr>
-      </w:pPr>
-      <w:r>
-        <w:rPr>
-          <w:rFonts w:ascii="Courier New" w:hAnsi="Courier New" w:cs="Courier New"/>
-        </w:rPr>
-        <w:t>[Service]</w:t>
-      </w:r>
-    </w:p>
-    <w:p>
-      <w:pPr>
-        <w:spacing w:after="0" w:line="240" w:lineRule="auto"/>
-        <w:rPr>
-          <w:rFonts w:ascii="Courier New" w:hAnsi="Courier New" w:cs="Courier New"/>
-        </w:rPr>
-      </w:pPr>
-      <w:r>
-        <w:rPr>
-          <w:rFonts w:ascii="Courier New" w:hAnsi="Courier New" w:cs="Courier New"/>
-        </w:rPr>
-        <w:t>ExecStart=/usr/local/bin/network_tuning.sh</w:t>
-      </w:r>
-    </w:p>
-    <w:p>
-      <w:pPr>
-        <w:spacing w:after="0" w:line="240" w:lineRule="auto"/>
-        <w:rPr>
-          <w:rFonts w:ascii="Courier New" w:hAnsi="Courier New" w:cs="Courier New"/>
-        </w:rPr>
-      </w:pPr>
-      <w:r>
-        <w:rPr>
-          <w:rFonts w:ascii="Courier New" w:hAnsi="Courier New" w:cs="Courier New"/>
-        </w:rPr>
-        <w:t>Type=oneshot</w:t>
-      </w:r>
-    </w:p>
-    <w:p>
-      <w:pPr>
-        <w:spacing w:after="0" w:line="240" w:lineRule="auto"/>
-        <w:rPr>
-          <w:rFonts w:ascii="Courier New" w:hAnsi="Courier New" w:cs="Courier New"/>
-        </w:rPr>
-      </w:pPr>
-      <w:r>
-        <w:rPr>
-          <w:rFonts w:ascii="Courier New" w:hAnsi="Courier New" w:cs="Courier New"/>
-        </w:rPr>
-        <w:t>RemainAfterExit=yes</w:t>
-      </w:r>
-    </w:p>
-    <w:p>
-      <w:pPr>
-        <w:spacing w:after="0" w:line="240" w:lineRule="auto"/>
-        <w:rPr>
-          <w:rFonts w:ascii="Courier New" w:hAnsi="Courier New" w:cs="Courier New"/>
-        </w:rPr>
-      </w:pPr>
-    </w:p>
-    <w:p>
-      <w:pPr>
-        <w:spacing w:after="0" w:line="240" w:lineRule="auto"/>
-        <w:rPr>
-          <w:rFonts w:ascii="Courier New" w:hAnsi="Courier New" w:cs="Courier New"/>
-        </w:rPr>
-      </w:pPr>
-      <w:r>
-        <w:rPr>
-          <w:rFonts w:ascii="Courier New" w:hAnsi="Courier New" w:cs="Courier New"/>
-        </w:rPr>
-        <w:t>[Install]</w:t>
-      </w:r>
-    </w:p>
-    <w:p>
-      <w:pPr>
-        <w:spacing w:after="0" w:line="240" w:lineRule="auto"/>
-        <w:rPr>
-          <w:rFonts w:ascii="Courier New" w:hAnsi="Courier New" w:cs="Courier New"/>
-        </w:rPr>
-      </w:pPr>
-      <w:r>
-        <w:rPr>
-          <w:rFonts w:ascii="Courier New" w:hAnsi="Courier New" w:cs="Courier New"/>
-        </w:rPr>
-        <w:lastRenderedPageBreak/>
         <w:t>WantedBy=multi-user.target</w:t>
       </w:r>
     </w:p>
@@ -3533,7 +3536,7 @@
 </file>
 
 <file path=word/endnotes.xml><?xml version="1.0" encoding="utf-8"?>
-<w:endnotes xmlns:wpc="http://schemas.microsoft.com/office/word/2010/wordprocessingCanvas" xmlns:cx="http://schemas.microsoft.com/office/drawing/2014/chartex" xmlns:cx1="http://schemas.microsoft.com/office/drawing/2015/9/8/chartex" xmlns:cx2="http://schemas.microsoft.com/office/drawing/2015/10/21/chartex" xmlns:cx3="http://schemas.microsoft.com/office/drawing/2016/5/9/chartex" xmlns:cx4="http://schemas.microsoft.com/office/drawing/2016/5/10/chartex" xmlns:cx5="http://schemas.microsoft.com/office/drawing/2016/5/11/chartex" xmlns:cx6="http://schemas.microsoft.com/office/drawing/2016/5/12/chartex" xmlns:cx7="http://schemas.microsoft.com/office/drawing/2016/5/13/chartex" xmlns:cx8="http://schemas.microsoft.com/office/drawing/2016/5/14/chartex" xmlns:mc="http://schemas.openxmlformats.org/markup-compatibility/2006" xmlns:aink="http://schemas.microsoft.com/office/drawing/2016/ink" xmlns:am3d="http://schemas.microsoft.com/office/drawing/2017/model3d" xmlns:o="urn:schemas-microsoft-com:office:office" xmlns:oel="http://schemas.microsoft.com/office/2019/extlst" xmlns:r="http://schemas.openxmlformats.org/officeDocument/2006/relationships" xmlns:m="http://schemas.openxmlformats.org/officeDocument/2006/math" xmlns:v="urn:schemas-microsoft-com:vml" xmlns:wp14="http://schemas.microsoft.com/office/word/2010/wordprocessingDrawing" xmlns:wp="http://schemas.openxmlformats.org/drawingml/2006/wordprocessingDrawing" xmlns:w10="urn:schemas-microsoft-com:office:word" xmlns:w="http://schemas.openxmlformats.org/wordprocessingml/2006/main" xmlns:w14="http://schemas.microsoft.com/office/word/2010/wordml" xmlns:w15="http://schemas.microsoft.com/office/word/2012/wordml" xmlns:w16cei="http://schemas.microsoft.com/office/word/2026/wordml/cei" xmlns:w16cex="http://schemas.microsoft.com/office/word/2018/wordml/cex" xmlns:w16cid="http://schemas.microsoft.com/office/word/2016/wordml/cid" xmlns:w16="http://schemas.microsoft.com/office/word/2018/wordml" xmlns:w16du="http://schemas.microsoft.com/office/word/2023/wordml/word16du" xmlns:w16sdtdh="http://schemas.microsoft.com/office/word/2020/wordml/sdtdatahash" xmlns:w16sdtfl="http://schemas.microsoft.com/office/word/2024/wordml/sdtformatlock" xmlns:w16se="http://schemas.microsoft.com/office/word/2015/wordml/symex" xmlns:wpg="http://schemas.microsoft.com/office/word/2010/wordprocessingGroup" xmlns:wpi="http://schemas.microsoft.com/office/word/2010/wordprocessingInk" xmlns:wne="http://schemas.microsoft.com/office/word/2006/wordml" xmlns:wps="http://schemas.microsoft.com/office/word/2010/wordprocessingShape" mc:Ignorable="w14 w15 w16se w16cid w16 w16cex w16sdtdh w16sdtfl w16du wp14">
+<w:endnotes xmlns:wpc="http://schemas.microsoft.com/office/word/2010/wordprocessingCanvas" xmlns:cx="http://schemas.microsoft.com/office/drawing/2014/chartex" xmlns:cx1="http://schemas.microsoft.com/office/drawing/2015/9/8/chartex" xmlns:cx2="http://schemas.microsoft.com/office/drawing/2015/10/21/chartex" xmlns:cx3="http://schemas.microsoft.com/office/drawing/2016/5/9/chartex" xmlns:cx4="http://schemas.microsoft.com/office/drawing/2016/5/10/chartex" xmlns:cx5="http://schemas.microsoft.com/office/drawing/2016/5/11/chartex" xmlns:cx6="http://schemas.microsoft.com/office/drawing/2016/5/12/chartex" xmlns:cx7="http://schemas.microsoft.com/office/drawing/2016/5/13/chartex" xmlns:cx8="http://schemas.microsoft.com/office/drawing/2016/5/14/chartex" xmlns:mc="http://schemas.openxmlformats.org/markup-compatibility/2006" xmlns:aink="http://schemas.microsoft.com/office/drawing/2016/ink" xmlns:am3d="http://schemas.microsoft.com/office/drawing/2017/model3d" xmlns:o="urn:schemas-microsoft-com:office:office" xmlns:oel="http://schemas.microsoft.com/office/2019/extlst" xmlns:r="http://schemas.openxmlformats.org/officeDocument/2006/relationships" xmlns:m="http://schemas.openxmlformats.org/officeDocument/2006/math" xmlns:v="urn:schemas-microsoft-com:vml" xmlns:wp14="http://schemas.microsoft.com/office/word/2010/wordprocessingDrawing" xmlns:wp="http://schemas.openxmlformats.org/drawingml/2006/wordprocessingDrawing" xmlns:w10="urn:schemas-microsoft-com:office:word" xmlns:w="http://schemas.openxmlformats.org/wordprocessingml/2006/main" xmlns:w14="http://schemas.microsoft.com/office/word/2010/wordml" xmlns:w15="http://schemas.microsoft.com/office/word/2012/wordml" xmlns:w16cex="http://schemas.microsoft.com/office/word/2018/wordml/cex" xmlns:w16cid="http://schemas.microsoft.com/office/word/2016/wordml/cid" xmlns:w16="http://schemas.microsoft.com/office/word/2018/wordml" xmlns:w16du="http://schemas.microsoft.com/office/word/2023/wordml/word16du" xmlns:w16sdtdh="http://schemas.microsoft.com/office/word/2020/wordml/sdtdatahash" xmlns:w16sdtfl="http://schemas.microsoft.com/office/word/2024/wordml/sdtformatlock" xmlns:w16se="http://schemas.microsoft.com/office/word/2015/wordml/symex" xmlns:wpg="http://schemas.microsoft.com/office/word/2010/wordprocessingGroup" xmlns:wpi="http://schemas.microsoft.com/office/word/2010/wordprocessingInk" xmlns:wne="http://schemas.microsoft.com/office/word/2006/wordml" xmlns:wps="http://schemas.microsoft.com/office/word/2010/wordprocessingShape" mc:Ignorable="w14 w15 w16se w16cid w16 w16cex w16sdtdh w16sdtfl w16du wp14">
   <w:endnote w:type="separator" w:id="-1">
     <w:p>
       <w:pPr>
@@ -3558,7 +3561,7 @@
 </file>
 
 <file path=word/footer1.xml><?xml version="1.0" encoding="utf-8"?>
-<w:ftr xmlns:wpc="http://schemas.microsoft.com/office/word/2010/wordprocessingCanvas" xmlns:cx="http://schemas.microsoft.com/office/drawing/2014/chartex" xmlns:cx1="http://schemas.microsoft.com/office/drawing/2015/9/8/chartex" xmlns:cx2="http://schemas.microsoft.com/office/drawing/2015/10/21/chartex" xmlns:cx3="http://schemas.microsoft.com/office/drawing/2016/5/9/chartex" xmlns:cx4="http://schemas.microsoft.com/office/drawing/2016/5/10/chartex" xmlns:cx5="http://schemas.microsoft.com/office/drawing/2016/5/11/chartex" xmlns:cx6="http://schemas.microsoft.com/office/drawing/2016/5/12/chartex" xmlns:cx7="http://schemas.microsoft.com/office/drawing/2016/5/13/chartex" xmlns:cx8="http://schemas.microsoft.com/office/drawing/2016/5/14/chartex" xmlns:mc="http://schemas.openxmlformats.org/markup-compatibility/2006" xmlns:aink="http://schemas.microsoft.com/office/drawing/2016/ink" xmlns:am3d="http://schemas.microsoft.com/office/drawing/2017/model3d" xmlns:o="urn:schemas-microsoft-com:office:office" xmlns:oel="http://schemas.microsoft.com/office/2019/extlst" xmlns:r="http://schemas.openxmlformats.org/officeDocument/2006/relationships" xmlns:m="http://schemas.openxmlformats.org/officeDocument/2006/math" xmlns:v="urn:schemas-microsoft-com:vml" xmlns:wp14="http://schemas.microsoft.com/office/word/2010/wordprocessingDrawing" xmlns:wp="http://schemas.openxmlformats.org/drawingml/2006/wordprocessingDrawing" xmlns:w10="urn:schemas-microsoft-com:office:word" xmlns:w="http://schemas.openxmlformats.org/wordprocessingml/2006/main" xmlns:w14="http://schemas.microsoft.com/office/word/2010/wordml" xmlns:w15="http://schemas.microsoft.com/office/word/2012/wordml" xmlns:w16cei="http://schemas.microsoft.com/office/word/2026/wordml/cei" xmlns:w16cex="http://schemas.microsoft.com/office/word/2018/wordml/cex" xmlns:w16cid="http://schemas.microsoft.com/office/word/2016/wordml/cid" xmlns:w16="http://schemas.microsoft.com/office/word/2018/wordml" xmlns:w16du="http://schemas.microsoft.com/office/word/2023/wordml/word16du" xmlns:w16sdtdh="http://schemas.microsoft.com/office/word/2020/wordml/sdtdatahash" xmlns:w16sdtfl="http://schemas.microsoft.com/office/word/2024/wordml/sdtformatlock" xmlns:w16se="http://schemas.microsoft.com/office/word/2015/wordml/symex" xmlns:wpg="http://schemas.microsoft.com/office/word/2010/wordprocessingGroup" xmlns:wpi="http://schemas.microsoft.com/office/word/2010/wordprocessingInk" xmlns:wne="http://schemas.microsoft.com/office/word/2006/wordml" xmlns:wps="http://schemas.microsoft.com/office/word/2010/wordprocessingShape" mc:Ignorable="w14 w15 w16se w16cid w16 w16cex w16sdtdh w16sdtfl w16du wp14">
+<w:ftr xmlns:wpc="http://schemas.microsoft.com/office/word/2010/wordprocessingCanvas" xmlns:cx="http://schemas.microsoft.com/office/drawing/2014/chartex" xmlns:cx1="http://schemas.microsoft.com/office/drawing/2015/9/8/chartex" xmlns:cx2="http://schemas.microsoft.com/office/drawing/2015/10/21/chartex" xmlns:cx3="http://schemas.microsoft.com/office/drawing/2016/5/9/chartex" xmlns:cx4="http://schemas.microsoft.com/office/drawing/2016/5/10/chartex" xmlns:cx5="http://schemas.microsoft.com/office/drawing/2016/5/11/chartex" xmlns:cx6="http://schemas.microsoft.com/office/drawing/2016/5/12/chartex" xmlns:cx7="http://schemas.microsoft.com/office/drawing/2016/5/13/chartex" xmlns:cx8="http://schemas.microsoft.com/office/drawing/2016/5/14/chartex" xmlns:mc="http://schemas.openxmlformats.org/markup-compatibility/2006" xmlns:aink="http://schemas.microsoft.com/office/drawing/2016/ink" xmlns:am3d="http://schemas.microsoft.com/office/drawing/2017/model3d" xmlns:o="urn:schemas-microsoft-com:office:office" xmlns:oel="http://schemas.microsoft.com/office/2019/extlst" xmlns:r="http://schemas.openxmlformats.org/officeDocument/2006/relationships" xmlns:m="http://schemas.openxmlformats.org/officeDocument/2006/math" xmlns:v="urn:schemas-microsoft-com:vml" xmlns:wp14="http://schemas.microsoft.com/office/word/2010/wordprocessingDrawing" xmlns:wp="http://schemas.openxmlformats.org/drawingml/2006/wordprocessingDrawing" xmlns:w10="urn:schemas-microsoft-com:office:word" xmlns:w="http://schemas.openxmlformats.org/wordprocessingml/2006/main" xmlns:w14="http://schemas.microsoft.com/office/word/2010/wordml" xmlns:w15="http://schemas.microsoft.com/office/word/2012/wordml" xmlns:w16cex="http://schemas.microsoft.com/office/word/2018/wordml/cex" xmlns:w16cid="http://schemas.microsoft.com/office/word/2016/wordml/cid" xmlns:w16="http://schemas.microsoft.com/office/word/2018/wordml" xmlns:w16du="http://schemas.microsoft.com/office/word/2023/wordml/word16du" xmlns:w16sdtdh="http://schemas.microsoft.com/office/word/2020/wordml/sdtdatahash" xmlns:w16sdtfl="http://schemas.microsoft.com/office/word/2024/wordml/sdtformatlock" xmlns:w16se="http://schemas.microsoft.com/office/word/2015/wordml/symex" xmlns:wpg="http://schemas.microsoft.com/office/word/2010/wordprocessingGroup" xmlns:wpi="http://schemas.microsoft.com/office/word/2010/wordprocessingInk" xmlns:wne="http://schemas.microsoft.com/office/word/2006/wordml" xmlns:wps="http://schemas.microsoft.com/office/word/2010/wordprocessingShape" mc:Ignorable="w14 w15 w16se w16cid w16 w16cex w16sdtdh w16sdtfl w16du wp14">
   <w:p>
     <w:pPr>
       <w:pStyle w:val="Footer"/>
@@ -3568,7 +3571,7 @@
 </file>
 
 <file path=word/footer2.xml><?xml version="1.0" encoding="utf-8"?>
-<w:ftr xmlns:wpc="http://schemas.microsoft.com/office/word/2010/wordprocessingCanvas" xmlns:cx="http://schemas.microsoft.com/office/drawing/2014/chartex" xmlns:cx1="http://schemas.microsoft.com/office/drawing/2015/9/8/chartex" xmlns:cx2="http://schemas.microsoft.com/office/drawing/2015/10/21/chartex" xmlns:cx3="http://schemas.microsoft.com/office/drawing/2016/5/9/chartex" xmlns:cx4="http://schemas.microsoft.com/office/drawing/2016/5/10/chartex" xmlns:cx5="http://schemas.microsoft.com/office/drawing/2016/5/11/chartex" xmlns:cx6="http://schemas.microsoft.com/office/drawing/2016/5/12/chartex" xmlns:cx7="http://schemas.microsoft.com/office/drawing/2016/5/13/chartex" xmlns:cx8="http://schemas.microsoft.com/office/drawing/2016/5/14/chartex" xmlns:mc="http://schemas.openxmlformats.org/markup-compatibility/2006" xmlns:aink="http://schemas.microsoft.com/office/drawing/2016/ink" xmlns:am3d="http://schemas.microsoft.com/office/drawing/2017/model3d" xmlns:o="urn:schemas-microsoft-com:office:office" xmlns:oel="http://schemas.microsoft.com/office/2019/extlst" xmlns:r="http://schemas.openxmlformats.org/officeDocument/2006/relationships" xmlns:m="http://schemas.openxmlformats.org/officeDocument/2006/math" xmlns:v="urn:schemas-microsoft-com:vml" xmlns:wp14="http://schemas.microsoft.com/office/word/2010/wordprocessingDrawing" xmlns:wp="http://schemas.openxmlformats.org/drawingml/2006/wordprocessingDrawing" xmlns:w10="urn:schemas-microsoft-com:office:word" xmlns:w="http://schemas.openxmlformats.org/wordprocessingml/2006/main" xmlns:w14="http://schemas.microsoft.com/office/word/2010/wordml" xmlns:w15="http://schemas.microsoft.com/office/word/2012/wordml" xmlns:w16cei="http://schemas.microsoft.com/office/word/2026/wordml/cei" xmlns:w16cex="http://schemas.microsoft.com/office/word/2018/wordml/cex" xmlns:w16cid="http://schemas.microsoft.com/office/word/2016/wordml/cid" xmlns:w16="http://schemas.microsoft.com/office/word/2018/wordml" xmlns:w16du="http://schemas.microsoft.com/office/word/2023/wordml/word16du" xmlns:w16sdtdh="http://schemas.microsoft.com/office/word/2020/wordml/sdtdatahash" xmlns:w16sdtfl="http://schemas.microsoft.com/office/word/2024/wordml/sdtformatlock" xmlns:w16se="http://schemas.microsoft.com/office/word/2015/wordml/symex" xmlns:wpg="http://schemas.microsoft.com/office/word/2010/wordprocessingGroup" xmlns:wpi="http://schemas.microsoft.com/office/word/2010/wordprocessingInk" xmlns:wne="http://schemas.microsoft.com/office/word/2006/wordml" xmlns:wps="http://schemas.microsoft.com/office/word/2010/wordprocessingShape" mc:Ignorable="w14 w15 w16se w16cid w16 w16cex w16sdtdh w16sdtfl w16du wp14">
+<w:ftr xmlns:wpc="http://schemas.microsoft.com/office/word/2010/wordprocessingCanvas" xmlns:cx="http://schemas.microsoft.com/office/drawing/2014/chartex" xmlns:cx1="http://schemas.microsoft.com/office/drawing/2015/9/8/chartex" xmlns:cx2="http://schemas.microsoft.com/office/drawing/2015/10/21/chartex" xmlns:cx3="http://schemas.microsoft.com/office/drawing/2016/5/9/chartex" xmlns:cx4="http://schemas.microsoft.com/office/drawing/2016/5/10/chartex" xmlns:cx5="http://schemas.microsoft.com/office/drawing/2016/5/11/chartex" xmlns:cx6="http://schemas.microsoft.com/office/drawing/2016/5/12/chartex" xmlns:cx7="http://schemas.microsoft.com/office/drawing/2016/5/13/chartex" xmlns:cx8="http://schemas.microsoft.com/office/drawing/2016/5/14/chartex" xmlns:mc="http://schemas.openxmlformats.org/markup-compatibility/2006" xmlns:aink="http://schemas.microsoft.com/office/drawing/2016/ink" xmlns:am3d="http://schemas.microsoft.com/office/drawing/2017/model3d" xmlns:o="urn:schemas-microsoft-com:office:office" xmlns:oel="http://schemas.microsoft.com/office/2019/extlst" xmlns:r="http://schemas.openxmlformats.org/officeDocument/2006/relationships" xmlns:m="http://schemas.openxmlformats.org/officeDocument/2006/math" xmlns:v="urn:schemas-microsoft-com:vml" xmlns:wp14="http://schemas.microsoft.com/office/word/2010/wordprocessingDrawing" xmlns:wp="http://schemas.openxmlformats.org/drawingml/2006/wordprocessingDrawing" xmlns:w10="urn:schemas-microsoft-com:office:word" xmlns:w="http://schemas.openxmlformats.org/wordprocessingml/2006/main" xmlns:w14="http://schemas.microsoft.com/office/word/2010/wordml" xmlns:w15="http://schemas.microsoft.com/office/word/2012/wordml" xmlns:w16cex="http://schemas.microsoft.com/office/word/2018/wordml/cex" xmlns:w16cid="http://schemas.microsoft.com/office/word/2016/wordml/cid" xmlns:w16="http://schemas.microsoft.com/office/word/2018/wordml" xmlns:w16du="http://schemas.microsoft.com/office/word/2023/wordml/word16du" xmlns:w16sdtdh="http://schemas.microsoft.com/office/word/2020/wordml/sdtdatahash" xmlns:w16sdtfl="http://schemas.microsoft.com/office/word/2024/wordml/sdtformatlock" xmlns:w16se="http://schemas.microsoft.com/office/word/2015/wordml/symex" xmlns:wpg="http://schemas.microsoft.com/office/word/2010/wordprocessingGroup" xmlns:wpi="http://schemas.microsoft.com/office/word/2010/wordprocessingInk" xmlns:wne="http://schemas.microsoft.com/office/word/2006/wordml" xmlns:wps="http://schemas.microsoft.com/office/word/2010/wordprocessingShape" mc:Ignorable="w14 w15 w16se w16cid w16 w16cex w16sdtdh w16sdtfl w16du wp14">
   <w:sdt>
     <w:sdtPr>
       <w:id w:val="1598591495"/>
@@ -3616,7 +3619,7 @@
 </file>
 
 <file path=word/footer3.xml><?xml version="1.0" encoding="utf-8"?>
-<w:ftr xmlns:wpc="http://schemas.microsoft.com/office/word/2010/wordprocessingCanvas" xmlns:cx="http://schemas.microsoft.com/office/drawing/2014/chartex" xmlns:cx1="http://schemas.microsoft.com/office/drawing/2015/9/8/chartex" xmlns:cx2="http://schemas.microsoft.com/office/drawing/2015/10/21/chartex" xmlns:cx3="http://schemas.microsoft.com/office/drawing/2016/5/9/chartex" xmlns:cx4="http://schemas.microsoft.com/office/drawing/2016/5/10/chartex" xmlns:cx5="http://schemas.microsoft.com/office/drawing/2016/5/11/chartex" xmlns:cx6="http://schemas.microsoft.com/office/drawing/2016/5/12/chartex" xmlns:cx7="http://schemas.microsoft.com/office/drawing/2016/5/13/chartex" xmlns:cx8="http://schemas.microsoft.com/office/drawing/2016/5/14/chartex" xmlns:mc="http://schemas.openxmlformats.org/markup-compatibility/2006" xmlns:aink="http://schemas.microsoft.com/office/drawing/2016/ink" xmlns:am3d="http://schemas.microsoft.com/office/drawing/2017/model3d" xmlns:o="urn:schemas-microsoft-com:office:office" xmlns:oel="http://schemas.microsoft.com/office/2019/extlst" xmlns:r="http://schemas.openxmlformats.org/officeDocument/2006/relationships" xmlns:m="http://schemas.openxmlformats.org/officeDocument/2006/math" xmlns:v="urn:schemas-microsoft-com:vml" xmlns:wp14="http://schemas.microsoft.com/office/word/2010/wordprocessingDrawing" xmlns:wp="http://schemas.openxmlformats.org/drawingml/2006/wordprocessingDrawing" xmlns:w10="urn:schemas-microsoft-com:office:word" xmlns:w="http://schemas.openxmlformats.org/wordprocessingml/2006/main" xmlns:w14="http://schemas.microsoft.com/office/word/2010/wordml" xmlns:w15="http://schemas.microsoft.com/office/word/2012/wordml" xmlns:w16cei="http://schemas.microsoft.com/office/word/2026/wordml/cei" xmlns:w16cex="http://schemas.microsoft.com/office/word/2018/wordml/cex" xmlns:w16cid="http://schemas.microsoft.com/office/word/2016/wordml/cid" xmlns:w16="http://schemas.microsoft.com/office/word/2018/wordml" xmlns:w16du="http://schemas.microsoft.com/office/word/2023/wordml/word16du" xmlns:w16sdtdh="http://schemas.microsoft.com/office/word/2020/wordml/sdtdatahash" xmlns:w16sdtfl="http://schemas.microsoft.com/office/word/2024/wordml/sdtformatlock" xmlns:w16se="http://schemas.microsoft.com/office/word/2015/wordml/symex" xmlns:wpg="http://schemas.microsoft.com/office/word/2010/wordprocessingGroup" xmlns:wpi="http://schemas.microsoft.com/office/word/2010/wordprocessingInk" xmlns:wne="http://schemas.microsoft.com/office/word/2006/wordml" xmlns:wps="http://schemas.microsoft.com/office/word/2010/wordprocessingShape" mc:Ignorable="w14 w15 w16se w16cid w16 w16cex w16sdtdh w16sdtfl w16du wp14">
+<w:ftr xmlns:wpc="http://schemas.microsoft.com/office/word/2010/wordprocessingCanvas" xmlns:cx="http://schemas.microsoft.com/office/drawing/2014/chartex" xmlns:cx1="http://schemas.microsoft.com/office/drawing/2015/9/8/chartex" xmlns:cx2="http://schemas.microsoft.com/office/drawing/2015/10/21/chartex" xmlns:cx3="http://schemas.microsoft.com/office/drawing/2016/5/9/chartex" xmlns:cx4="http://schemas.microsoft.com/office/drawing/2016/5/10/chartex" xmlns:cx5="http://schemas.microsoft.com/office/drawing/2016/5/11/chartex" xmlns:cx6="http://schemas.microsoft.com/office/drawing/2016/5/12/chartex" xmlns:cx7="http://schemas.microsoft.com/office/drawing/2016/5/13/chartex" xmlns:cx8="http://schemas.microsoft.com/office/drawing/2016/5/14/chartex" xmlns:mc="http://schemas.openxmlformats.org/markup-compatibility/2006" xmlns:aink="http://schemas.microsoft.com/office/drawing/2016/ink" xmlns:am3d="http://schemas.microsoft.com/office/drawing/2017/model3d" xmlns:o="urn:schemas-microsoft-com:office:office" xmlns:oel="http://schemas.microsoft.com/office/2019/extlst" xmlns:r="http://schemas.openxmlformats.org/officeDocument/2006/relationships" xmlns:m="http://schemas.openxmlformats.org/officeDocument/2006/math" xmlns:v="urn:schemas-microsoft-com:vml" xmlns:wp14="http://schemas.microsoft.com/office/word/2010/wordprocessingDrawing" xmlns:wp="http://schemas.openxmlformats.org/drawingml/2006/wordprocessingDrawing" xmlns:w10="urn:schemas-microsoft-com:office:word" xmlns:w="http://schemas.openxmlformats.org/wordprocessingml/2006/main" xmlns:w14="http://schemas.microsoft.com/office/word/2010/wordml" xmlns:w15="http://schemas.microsoft.com/office/word/2012/wordml" xmlns:w16cex="http://schemas.microsoft.com/office/word/2018/wordml/cex" xmlns:w16cid="http://schemas.microsoft.com/office/word/2016/wordml/cid" xmlns:w16="http://schemas.microsoft.com/office/word/2018/wordml" xmlns:w16du="http://schemas.microsoft.com/office/word/2023/wordml/word16du" xmlns:w16sdtdh="http://schemas.microsoft.com/office/word/2020/wordml/sdtdatahash" xmlns:w16sdtfl="http://schemas.microsoft.com/office/word/2024/wordml/sdtformatlock" xmlns:w16se="http://schemas.microsoft.com/office/word/2015/wordml/symex" xmlns:wpg="http://schemas.microsoft.com/office/word/2010/wordprocessingGroup" xmlns:wpi="http://schemas.microsoft.com/office/word/2010/wordprocessingInk" xmlns:wne="http://schemas.microsoft.com/office/word/2006/wordml" xmlns:wps="http://schemas.microsoft.com/office/word/2010/wordprocessingShape" mc:Ignorable="w14 w15 w16se w16cid w16 w16cex w16sdtdh w16sdtfl w16du wp14">
   <w:p>
     <w:pPr>
       <w:pStyle w:val="Footer"/>
@@ -3626,7 +3629,7 @@
 </file>
 
 <file path=word/footnotes.xml><?xml version="1.0" encoding="utf-8"?>
-<w:footnotes xmlns:wpc="http://schemas.microsoft.com/office/word/2010/wordprocessingCanvas" xmlns:cx="http://schemas.microsoft.com/office/drawing/2014/chartex" xmlns:cx1="http://schemas.microsoft.com/office/drawing/2015/9/8/chartex" xmlns:cx2="http://schemas.microsoft.com/office/drawing/2015/10/21/chartex" xmlns:cx3="http://schemas.microsoft.com/office/drawing/2016/5/9/chartex" xmlns:cx4="http://schemas.microsoft.com/office/drawing/2016/5/10/chartex" xmlns:cx5="http://schemas.microsoft.com/office/drawing/2016/5/11/chartex" xmlns:cx6="http://schemas.microsoft.com/office/drawing/2016/5/12/chartex" xmlns:cx7="http://schemas.microsoft.com/office/drawing/2016/5/13/chartex" xmlns:cx8="http://schemas.microsoft.com/office/drawing/2016/5/14/chartex" xmlns:mc="http://schemas.openxmlformats.org/markup-compatibility/2006" xmlns:aink="http://schemas.microsoft.com/office/drawing/2016/ink" xmlns:am3d="http://schemas.microsoft.com/office/drawing/2017/model3d" xmlns:o="urn:schemas-microsoft-com:office:office" xmlns:oel="http://schemas.microsoft.com/office/2019/extlst" xmlns:r="http://schemas.openxmlformats.org/officeDocument/2006/relationships" xmlns:m="http://schemas.openxmlformats.org/officeDocument/2006/math" xmlns:v="urn:schemas-microsoft-com:vml" xmlns:wp14="http://schemas.microsoft.com/office/word/2010/wordprocessingDrawing" xmlns:wp="http://schemas.openxmlformats.org/drawingml/2006/wordprocessingDrawing" xmlns:w10="urn:schemas-microsoft-com:office:word" xmlns:w="http://schemas.openxmlformats.org/wordprocessingml/2006/main" xmlns:w14="http://schemas.microsoft.com/office/word/2010/wordml" xmlns:w15="http://schemas.microsoft.com/office/word/2012/wordml" xmlns:w16cei="http://schemas.microsoft.com/office/word/2026/wordml/cei" xmlns:w16cex="http://schemas.microsoft.com/office/word/2018/wordml/cex" xmlns:w16cid="http://schemas.microsoft.com/office/word/2016/wordml/cid" xmlns:w16="http://schemas.microsoft.com/office/word/2018/wordml" xmlns:w16du="http://schemas.microsoft.com/office/word/2023/wordml/word16du" xmlns:w16sdtdh="http://schemas.microsoft.com/office/word/2020/wordml/sdtdatahash" xmlns:w16sdtfl="http://schemas.microsoft.com/office/word/2024/wordml/sdtformatlock" xmlns:w16se="http://schemas.microsoft.com/office/word/2015/wordml/symex" xmlns:wpg="http://schemas.microsoft.com/office/word/2010/wordprocessingGroup" xmlns:wpi="http://schemas.microsoft.com/office/word/2010/wordprocessingInk" xmlns:wne="http://schemas.microsoft.com/office/word/2006/wordml" xmlns:wps="http://schemas.microsoft.com/office/word/2010/wordprocessingShape" mc:Ignorable="w14 w15 w16se w16cid w16 w16cex w16sdtdh w16sdtfl w16du wp14">
+<w:footnotes xmlns:wpc="http://schemas.microsoft.com/office/word/2010/wordprocessingCanvas" xmlns:cx="http://schemas.microsoft.com/office/drawing/2014/chartex" xmlns:cx1="http://schemas.microsoft.com/office/drawing/2015/9/8/chartex" xmlns:cx2="http://schemas.microsoft.com/office/drawing/2015/10/21/chartex" xmlns:cx3="http://schemas.microsoft.com/office/drawing/2016/5/9/chartex" xmlns:cx4="http://schemas.microsoft.com/office/drawing/2016/5/10/chartex" xmlns:cx5="http://schemas.microsoft.com/office/drawing/2016/5/11/chartex" xmlns:cx6="http://schemas.microsoft.com/office/drawing/2016/5/12/chartex" xmlns:cx7="http://schemas.microsoft.com/office/drawing/2016/5/13/chartex" xmlns:cx8="http://schemas.microsoft.com/office/drawing/2016/5/14/chartex" xmlns:mc="http://schemas.openxmlformats.org/markup-compatibility/2006" xmlns:aink="http://schemas.microsoft.com/office/drawing/2016/ink" xmlns:am3d="http://schemas.microsoft.com/office/drawing/2017/model3d" xmlns:o="urn:schemas-microsoft-com:office:office" xmlns:oel="http://schemas.microsoft.com/office/2019/extlst" xmlns:r="http://schemas.openxmlformats.org/officeDocument/2006/relationships" xmlns:m="http://schemas.openxmlformats.org/officeDocument/2006/math" xmlns:v="urn:schemas-microsoft-com:vml" xmlns:wp14="http://schemas.microsoft.com/office/word/2010/wordprocessingDrawing" xmlns:wp="http://schemas.openxmlformats.org/drawingml/2006/wordprocessingDrawing" xmlns:w10="urn:schemas-microsoft-com:office:word" xmlns:w="http://schemas.openxmlformats.org/wordprocessingml/2006/main" xmlns:w14="http://schemas.microsoft.com/office/word/2010/wordml" xmlns:w15="http://schemas.microsoft.com/office/word/2012/wordml" xmlns:w16cex="http://schemas.microsoft.com/office/word/2018/wordml/cex" xmlns:w16cid="http://schemas.microsoft.com/office/word/2016/wordml/cid" xmlns:w16="http://schemas.microsoft.com/office/word/2018/wordml" xmlns:w16du="http://schemas.microsoft.com/office/word/2023/wordml/word16du" xmlns:w16sdtdh="http://schemas.microsoft.com/office/word/2020/wordml/sdtdatahash" xmlns:w16sdtfl="http://schemas.microsoft.com/office/word/2024/wordml/sdtformatlock" xmlns:w16se="http://schemas.microsoft.com/office/word/2015/wordml/symex" xmlns:wpg="http://schemas.microsoft.com/office/word/2010/wordprocessingGroup" xmlns:wpi="http://schemas.microsoft.com/office/word/2010/wordprocessingInk" xmlns:wne="http://schemas.microsoft.com/office/word/2006/wordml" xmlns:wps="http://schemas.microsoft.com/office/word/2010/wordprocessingShape" mc:Ignorable="w14 w15 w16se w16cid w16 w16cex w16sdtdh w16sdtfl w16du wp14">
   <w:footnote w:type="separator" w:id="-1">
     <w:p>
       <w:pPr>
@@ -3867,7 +3870,7 @@
 </file>
 
 <file path=word/header1.xml><?xml version="1.0" encoding="utf-8"?>
-<w:hdr xmlns:wpc="http://schemas.microsoft.com/office/word/2010/wordprocessingCanvas" xmlns:cx="http://schemas.microsoft.com/office/drawing/2014/chartex" xmlns:cx1="http://schemas.microsoft.com/office/drawing/2015/9/8/chartex" xmlns:cx2="http://schemas.microsoft.com/office/drawing/2015/10/21/chartex" xmlns:cx3="http://schemas.microsoft.com/office/drawing/2016/5/9/chartex" xmlns:cx4="http://schemas.microsoft.com/office/drawing/2016/5/10/chartex" xmlns:cx5="http://schemas.microsoft.com/office/drawing/2016/5/11/chartex" xmlns:cx6="http://schemas.microsoft.com/office/drawing/2016/5/12/chartex" xmlns:cx7="http://schemas.microsoft.com/office/drawing/2016/5/13/chartex" xmlns:cx8="http://schemas.microsoft.com/office/drawing/2016/5/14/chartex" xmlns:mc="http://schemas.openxmlformats.org/markup-compatibility/2006" xmlns:aink="http://schemas.microsoft.com/office/drawing/2016/ink" xmlns:am3d="http://schemas.microsoft.com/office/drawing/2017/model3d" xmlns:o="urn:schemas-microsoft-com:office:office" xmlns:oel="http://schemas.microsoft.com/office/2019/extlst" xmlns:r="http://schemas.openxmlformats.org/officeDocument/2006/relationships" xmlns:m="http://schemas.openxmlformats.org/officeDocument/2006/math" xmlns:v="urn:schemas-microsoft-com:vml" xmlns:wp14="http://schemas.microsoft.com/office/word/2010/wordprocessingDrawing" xmlns:wp="http://schemas.openxmlformats.org/drawingml/2006/wordprocessingDrawing" xmlns:w10="urn:schemas-microsoft-com:office:word" xmlns:w="http://schemas.openxmlformats.org/wordprocessingml/2006/main" xmlns:w14="http://schemas.microsoft.com/office/word/2010/wordml" xmlns:w15="http://schemas.microsoft.com/office/word/2012/wordml" xmlns:w16cei="http://schemas.microsoft.com/office/word/2026/wordml/cei" xmlns:w16cex="http://schemas.microsoft.com/office/word/2018/wordml/cex" xmlns:w16cid="http://schemas.microsoft.com/office/word/2016/wordml/cid" xmlns:w16="http://schemas.microsoft.com/office/word/2018/wordml" xmlns:w16du="http://schemas.microsoft.com/office/word/2023/wordml/word16du" xmlns:w16sdtdh="http://schemas.microsoft.com/office/word/2020/wordml/sdtdatahash" xmlns:w16sdtfl="http://schemas.microsoft.com/office/word/2024/wordml/sdtformatlock" xmlns:w16se="http://schemas.microsoft.com/office/word/2015/wordml/symex" xmlns:wpg="http://schemas.microsoft.com/office/word/2010/wordprocessingGroup" xmlns:wpi="http://schemas.microsoft.com/office/word/2010/wordprocessingInk" xmlns:wne="http://schemas.microsoft.com/office/word/2006/wordml" xmlns:wps="http://schemas.microsoft.com/office/word/2010/wordprocessingShape" mc:Ignorable="w14 w15 w16se w16cid w16 w16cex w16sdtdh w16sdtfl w16du wp14">
+<w:hdr xmlns:wpc="http://schemas.microsoft.com/office/word/2010/wordprocessingCanvas" xmlns:cx="http://schemas.microsoft.com/office/drawing/2014/chartex" xmlns:cx1="http://schemas.microsoft.com/office/drawing/2015/9/8/chartex" xmlns:cx2="http://schemas.microsoft.com/office/drawing/2015/10/21/chartex" xmlns:cx3="http://schemas.microsoft.com/office/drawing/2016/5/9/chartex" xmlns:cx4="http://schemas.microsoft.com/office/drawing/2016/5/10/chartex" xmlns:cx5="http://schemas.microsoft.com/office/drawing/2016/5/11/chartex" xmlns:cx6="http://schemas.microsoft.com/office/drawing/2016/5/12/chartex" xmlns:cx7="http://schemas.microsoft.com/office/drawing/2016/5/13/chartex" xmlns:cx8="http://schemas.microsoft.com/office/drawing/2016/5/14/chartex" xmlns:mc="http://schemas.openxmlformats.org/markup-compatibility/2006" xmlns:aink="http://schemas.microsoft.com/office/drawing/2016/ink" xmlns:am3d="http://schemas.microsoft.com/office/drawing/2017/model3d" xmlns:o="urn:schemas-microsoft-com:office:office" xmlns:oel="http://schemas.microsoft.com/office/2019/extlst" xmlns:r="http://schemas.openxmlformats.org/officeDocument/2006/relationships" xmlns:m="http://schemas.openxmlformats.org/officeDocument/2006/math" xmlns:v="urn:schemas-microsoft-com:vml" xmlns:wp14="http://schemas.microsoft.com/office/word/2010/wordprocessingDrawing" xmlns:wp="http://schemas.openxmlformats.org/drawingml/2006/wordprocessingDrawing" xmlns:w10="urn:schemas-microsoft-com:office:word" xmlns:w="http://schemas.openxmlformats.org/wordprocessingml/2006/main" xmlns:w14="http://schemas.microsoft.com/office/word/2010/wordml" xmlns:w15="http://schemas.microsoft.com/office/word/2012/wordml" xmlns:w16cex="http://schemas.microsoft.com/office/word/2018/wordml/cex" xmlns:w16cid="http://schemas.microsoft.com/office/word/2016/wordml/cid" xmlns:w16="http://schemas.microsoft.com/office/word/2018/wordml" xmlns:w16du="http://schemas.microsoft.com/office/word/2023/wordml/word16du" xmlns:w16sdtdh="http://schemas.microsoft.com/office/word/2020/wordml/sdtdatahash" xmlns:w16sdtfl="http://schemas.microsoft.com/office/word/2024/wordml/sdtformatlock" xmlns:w16se="http://schemas.microsoft.com/office/word/2015/wordml/symex" xmlns:wpg="http://schemas.microsoft.com/office/word/2010/wordprocessingGroup" xmlns:wpi="http://schemas.microsoft.com/office/word/2010/wordprocessingInk" xmlns:wne="http://schemas.microsoft.com/office/word/2006/wordml" xmlns:wps="http://schemas.microsoft.com/office/word/2010/wordprocessingShape" mc:Ignorable="w14 w15 w16se w16cid w16 w16cex w16sdtdh w16sdtfl w16du wp14">
   <w:p>
     <w:pPr>
       <w:pStyle w:val="Header"/>
@@ -3877,7 +3880,7 @@
 </file>
 
 <file path=word/header2.xml><?xml version="1.0" encoding="utf-8"?>
-<w:hdr xmlns:wpc="http://schemas.microsoft.com/office/word/2010/wordprocessingCanvas" xmlns:cx="http://schemas.microsoft.com/office/drawing/2014/chartex" xmlns:cx1="http://schemas.microsoft.com/office/drawing/2015/9/8/chartex" xmlns:cx2="http://schemas.microsoft.com/office/drawing/2015/10/21/chartex" xmlns:cx3="http://schemas.microsoft.com/office/drawing/2016/5/9/chartex" xmlns:cx4="http://schemas.microsoft.com/office/drawing/2016/5/10/chartex" xmlns:cx5="http://schemas.microsoft.com/office/drawing/2016/5/11/chartex" xmlns:cx6="http://schemas.microsoft.com/office/drawing/2016/5/12/chartex" xmlns:cx7="http://schemas.microsoft.com/office/drawing/2016/5/13/chartex" xmlns:cx8="http://schemas.microsoft.com/office/drawing/2016/5/14/chartex" xmlns:mc="http://schemas.openxmlformats.org/markup-compatibility/2006" xmlns:aink="http://schemas.microsoft.com/office/drawing/2016/ink" xmlns:am3d="http://schemas.microsoft.com/office/drawing/2017/model3d" xmlns:o="urn:schemas-microsoft-com:office:office" xmlns:oel="http://schemas.microsoft.com/office/2019/extlst" xmlns:r="http://schemas.openxmlformats.org/officeDocument/2006/relationships" xmlns:m="http://schemas.openxmlformats.org/officeDocument/2006/math" xmlns:v="urn:schemas-microsoft-com:vml" xmlns:wp14="http://schemas.microsoft.com/office/word/2010/wordprocessingDrawing" xmlns:wp="http://schemas.openxmlformats.org/drawingml/2006/wordprocessingDrawing" xmlns:w10="urn:schemas-microsoft-com:office:word" xmlns:w="http://schemas.openxmlformats.org/wordprocessingml/2006/main" xmlns:w14="http://schemas.microsoft.com/office/word/2010/wordml" xmlns:w15="http://schemas.microsoft.com/office/word/2012/wordml" xmlns:w16cei="http://schemas.microsoft.com/office/word/2026/wordml/cei" xmlns:w16cex="http://schemas.microsoft.com/office/word/2018/wordml/cex" xmlns:w16cid="http://schemas.microsoft.com/office/word/2016/wordml/cid" xmlns:w16="http://schemas.microsoft.com/office/word/2018/wordml" xmlns:w16du="http://schemas.microsoft.com/office/word/2023/wordml/word16du" xmlns:w16sdtdh="http://schemas.microsoft.com/office/word/2020/wordml/sdtdatahash" xmlns:w16sdtfl="http://schemas.microsoft.com/office/word/2024/wordml/sdtformatlock" xmlns:w16se="http://schemas.microsoft.com/office/word/2015/wordml/symex" xmlns:wpg="http://schemas.microsoft.com/office/word/2010/wordprocessingGroup" xmlns:wpi="http://schemas.microsoft.com/office/word/2010/wordprocessingInk" xmlns:wne="http://schemas.microsoft.com/office/word/2006/wordml" xmlns:wps="http://schemas.microsoft.com/office/word/2010/wordprocessingShape" mc:Ignorable="w14 w15 w16se w16cid w16 w16cex w16sdtdh w16sdtfl w16du wp14">
+<w:hdr xmlns:wpc="http://schemas.microsoft.com/office/word/2010/wordprocessingCanvas" xmlns:cx="http://schemas.microsoft.com/office/drawing/2014/chartex" xmlns:cx1="http://schemas.microsoft.com/office/drawing/2015/9/8/chartex" xmlns:cx2="http://schemas.microsoft.com/office/drawing/2015/10/21/chartex" xmlns:cx3="http://schemas.microsoft.com/office/drawing/2016/5/9/chartex" xmlns:cx4="http://schemas.microsoft.com/office/drawing/2016/5/10/chartex" xmlns:cx5="http://schemas.microsoft.com/office/drawing/2016/5/11/chartex" xmlns:cx6="http://schemas.microsoft.com/office/drawing/2016/5/12/chartex" xmlns:cx7="http://schemas.microsoft.com/office/drawing/2016/5/13/chartex" xmlns:cx8="http://schemas.microsoft.com/office/drawing/2016/5/14/chartex" xmlns:mc="http://schemas.openxmlformats.org/markup-compatibility/2006" xmlns:aink="http://schemas.microsoft.com/office/drawing/2016/ink" xmlns:am3d="http://schemas.microsoft.com/office/drawing/2017/model3d" xmlns:o="urn:schemas-microsoft-com:office:office" xmlns:oel="http://schemas.microsoft.com/office/2019/extlst" xmlns:r="http://schemas.openxmlformats.org/officeDocument/2006/relationships" xmlns:m="http://schemas.openxmlformats.org/officeDocument/2006/math" xmlns:v="urn:schemas-microsoft-com:vml" xmlns:wp14="http://schemas.microsoft.com/office/word/2010/wordprocessingDrawing" xmlns:wp="http://schemas.openxmlformats.org/drawingml/2006/wordprocessingDrawing" xmlns:w10="urn:schemas-microsoft-com:office:word" xmlns:w="http://schemas.openxmlformats.org/wordprocessingml/2006/main" xmlns:w14="http://schemas.microsoft.com/office/word/2010/wordml" xmlns:w15="http://schemas.microsoft.com/office/word/2012/wordml" xmlns:w16cex="http://schemas.microsoft.com/office/word/2018/wordml/cex" xmlns:w16cid="http://schemas.microsoft.com/office/word/2016/wordml/cid" xmlns:w16="http://schemas.microsoft.com/office/word/2018/wordml" xmlns:w16du="http://schemas.microsoft.com/office/word/2023/wordml/word16du" xmlns:w16sdtdh="http://schemas.microsoft.com/office/word/2020/wordml/sdtdatahash" xmlns:w16sdtfl="http://schemas.microsoft.com/office/word/2024/wordml/sdtformatlock" xmlns:w16se="http://schemas.microsoft.com/office/word/2015/wordml/symex" xmlns:wpg="http://schemas.microsoft.com/office/word/2010/wordprocessingGroup" xmlns:wpi="http://schemas.microsoft.com/office/word/2010/wordprocessingInk" xmlns:wne="http://schemas.microsoft.com/office/word/2006/wordml" xmlns:wps="http://schemas.microsoft.com/office/word/2010/wordprocessingShape" mc:Ignorable="w14 w15 w16se w16cid w16 w16cex w16sdtdh w16sdtfl w16du wp14">
   <w:p>
     <w:pPr>
       <w:pStyle w:val="Header"/>
@@ -3898,7 +3901,7 @@
       <w:t>2</w:t>
     </w:r>
     <w:r>
-      <w:t>3</w:t>
+      <w:t>4</w:t>
     </w:r>
     <w:r>
       <w:tab/>
@@ -3907,7 +3910,7 @@
       <w:tab/>
     </w:r>
     <w:r>
-      <w:t>8/17</w:t>
+      <w:t>9/2</w:t>
     </w:r>
     <w:r>
       <w:t>/2026</w:t>
@@ -3917,7 +3920,7 @@
 </file>
 
 <file path=word/header3.xml><?xml version="1.0" encoding="utf-8"?>
-<w:hdr xmlns:wpc="http://schemas.microsoft.com/office/word/2010/wordprocessingCanvas" xmlns:cx="http://schemas.microsoft.com/office/drawing/2014/chartex" xmlns:cx1="http://schemas.microsoft.com/office/drawing/2015/9/8/chartex" xmlns:cx2="http://schemas.microsoft.com/office/drawing/2015/10/21/chartex" xmlns:cx3="http://schemas.microsoft.com/office/drawing/2016/5/9/chartex" xmlns:cx4="http://schemas.microsoft.com/office/drawing/2016/5/10/chartex" xmlns:cx5="http://schemas.microsoft.com/office/drawing/2016/5/11/chartex" xmlns:cx6="http://schemas.microsoft.com/office/drawing/2016/5/12/chartex" xmlns:cx7="http://schemas.microsoft.com/office/drawing/2016/5/13/chartex" xmlns:cx8="http://schemas.microsoft.com/office/drawing/2016/5/14/chartex" xmlns:mc="http://schemas.openxmlformats.org/markup-compatibility/2006" xmlns:aink="http://schemas.microsoft.com/office/drawing/2016/ink" xmlns:am3d="http://schemas.microsoft.com/office/drawing/2017/model3d" xmlns:o="urn:schemas-microsoft-com:office:office" xmlns:oel="http://schemas.microsoft.com/office/2019/extlst" xmlns:r="http://schemas.openxmlformats.org/officeDocument/2006/relationships" xmlns:m="http://schemas.openxmlformats.org/officeDocument/2006/math" xmlns:v="urn:schemas-microsoft-com:vml" xmlns:wp14="http://schemas.microsoft.com/office/word/2010/wordprocessingDrawing" xmlns:wp="http://schemas.openxmlformats.org/drawingml/2006/wordprocessingDrawing" xmlns:w10="urn:schemas-microsoft-com:office:word" xmlns:w="http://schemas.openxmlformats.org/wordprocessingml/2006/main" xmlns:w14="http://schemas.microsoft.com/office/word/2010/wordml" xmlns:w15="http://schemas.microsoft.com/office/word/2012/wordml" xmlns:w16cei="http://schemas.microsoft.com/office/word/2026/wordml/cei" xmlns:w16cex="http://schemas.microsoft.com/office/word/2018/wordml/cex" xmlns:w16cid="http://schemas.microsoft.com/office/word/2016/wordml/cid" xmlns:w16="http://schemas.microsoft.com/office/word/2018/wordml" xmlns:w16du="http://schemas.microsoft.com/office/word/2023/wordml/word16du" xmlns:w16sdtdh="http://schemas.microsoft.com/office/word/2020/wordml/sdtdatahash" xmlns:w16sdtfl="http://schemas.microsoft.com/office/word/2024/wordml/sdtformatlock" xmlns:w16se="http://schemas.microsoft.com/office/word/2015/wordml/symex" xmlns:wpg="http://schemas.microsoft.com/office/word/2010/wordprocessingGroup" xmlns:wpi="http://schemas.microsoft.com/office/word/2010/wordprocessingInk" xmlns:wne="http://schemas.microsoft.com/office/word/2006/wordml" xmlns:wps="http://schemas.microsoft.com/office/word/2010/wordprocessingShape" mc:Ignorable="w14 w15 w16se w16cid w16 w16cex w16sdtdh w16sdtfl w16du wp14">
+<w:hdr xmlns:wpc="http://schemas.microsoft.com/office/word/2010/wordprocessingCanvas" xmlns:cx="http://schemas.microsoft.com/office/drawing/2014/chartex" xmlns:cx1="http://schemas.microsoft.com/office/drawing/2015/9/8/chartex" xmlns:cx2="http://schemas.microsoft.com/office/drawing/2015/10/21/chartex" xmlns:cx3="http://schemas.microsoft.com/office/drawing/2016/5/9/chartex" xmlns:cx4="http://schemas.microsoft.com/office/drawing/2016/5/10/chartex" xmlns:cx5="http://schemas.microsoft.com/office/drawing/2016/5/11/chartex" xmlns:cx6="http://schemas.microsoft.com/office/drawing/2016/5/12/chartex" xmlns:cx7="http://schemas.microsoft.com/office/drawing/2016/5/13/chartex" xmlns:cx8="http://schemas.microsoft.com/office/drawing/2016/5/14/chartex" xmlns:mc="http://schemas.openxmlformats.org/markup-compatibility/2006" xmlns:aink="http://schemas.microsoft.com/office/drawing/2016/ink" xmlns:am3d="http://schemas.microsoft.com/office/drawing/2017/model3d" xmlns:o="urn:schemas-microsoft-com:office:office" xmlns:oel="http://schemas.microsoft.com/office/2019/extlst" xmlns:r="http://schemas.openxmlformats.org/officeDocument/2006/relationships" xmlns:m="http://schemas.openxmlformats.org/officeDocument/2006/math" xmlns:v="urn:schemas-microsoft-com:vml" xmlns:wp14="http://schemas.microsoft.com/office/word/2010/wordprocessingDrawing" xmlns:wp="http://schemas.openxmlformats.org/drawingml/2006/wordprocessingDrawing" xmlns:w10="urn:schemas-microsoft-com:office:word" xmlns:w="http://schemas.openxmlformats.org/wordprocessingml/2006/main" xmlns:w14="http://schemas.microsoft.com/office/word/2010/wordml" xmlns:w15="http://schemas.microsoft.com/office/word/2012/wordml" xmlns:w16cex="http://schemas.microsoft.com/office/word/2018/wordml/cex" xmlns:w16cid="http://schemas.microsoft.com/office/word/2016/wordml/cid" xmlns:w16="http://schemas.microsoft.com/office/word/2018/wordml" xmlns:w16du="http://schemas.microsoft.com/office/word/2023/wordml/word16du" xmlns:w16sdtdh="http://schemas.microsoft.com/office/word/2020/wordml/sdtdatahash" xmlns:w16sdtfl="http://schemas.microsoft.com/office/word/2024/wordml/sdtformatlock" xmlns:w16se="http://schemas.microsoft.com/office/word/2015/wordml/symex" xmlns:wpg="http://schemas.microsoft.com/office/word/2010/wordprocessingGroup" xmlns:wpi="http://schemas.microsoft.com/office/word/2010/wordprocessingInk" xmlns:wne="http://schemas.microsoft.com/office/word/2006/wordml" xmlns:wps="http://schemas.microsoft.com/office/word/2010/wordprocessingShape" mc:Ignorable="w14 w15 w16se w16cid w16 w16cex w16sdtdh w16sdtfl w16du wp14">
   <w:p>
     <w:pPr>
       <w:pStyle w:val="Header"/>
@@ -3927,7 +3930,7 @@
 </file>
 
 <file path=word/numbering.xml><?xml version="1.0" encoding="utf-8"?>
-<w:numbering xmlns:wpc="http://schemas.microsoft.com/office/word/2010/wordprocessingCanvas" xmlns:cx="http://schemas.microsoft.com/office/drawing/2014/chartex" xmlns:cx1="http://schemas.microsoft.com/office/drawing/2015/9/8/chartex" xmlns:cx2="http://schemas.microsoft.com/office/drawing/2015/10/21/chartex" xmlns:cx3="http://schemas.microsoft.com/office/drawing/2016/5/9/chartex" xmlns:cx4="http://schemas.microsoft.com/office/drawing/2016/5/10/chartex" xmlns:cx5="http://schemas.microsoft.com/office/drawing/2016/5/11/chartex" xmlns:cx6="http://schemas.microsoft.com/office/drawing/2016/5/12/chartex" xmlns:cx7="http://schemas.microsoft.com/office/drawing/2016/5/13/chartex" xmlns:cx8="http://schemas.microsoft.com/office/drawing/2016/5/14/chartex" xmlns:mc="http://schemas.openxmlformats.org/markup-compatibility/2006" xmlns:aink="http://schemas.microsoft.com/office/drawing/2016/ink" xmlns:am3d="http://schemas.microsoft.com/office/drawing/2017/model3d" xmlns:o="urn:schemas-microsoft-com:office:office" xmlns:oel="http://schemas.microsoft.com/office/2019/extlst" xmlns:r="http://schemas.openxmlformats.org/officeDocument/2006/relationships" xmlns:m="http://schemas.openxmlformats.org/officeDocument/2006/math" xmlns:v="urn:schemas-microsoft-com:vml" xmlns:wp14="http://schemas.microsoft.com/office/word/2010/wordprocessingDrawing" xmlns:wp="http://schemas.openxmlformats.org/drawingml/2006/wordprocessingDrawing" xmlns:w10="urn:schemas-microsoft-com:office:word" xmlns:w="http://schemas.openxmlformats.org/wordprocessingml/2006/main" xmlns:w14="http://schemas.microsoft.com/office/word/2010/wordml" xmlns:w15="http://schemas.microsoft.com/office/word/2012/wordml" xmlns:w16cei="http://schemas.microsoft.com/office/word/2026/wordml/cei" xmlns:w16cex="http://schemas.microsoft.com/office/word/2018/wordml/cex" xmlns:w16cid="http://schemas.microsoft.com/office/word/2016/wordml/cid" xmlns:w16="http://schemas.microsoft.com/office/word/2018/wordml" xmlns:w16du="http://schemas.microsoft.com/office/word/2023/wordml/word16du" xmlns:w16sdtdh="http://schemas.microsoft.com/office/word/2020/wordml/sdtdatahash" xmlns:w16sdtfl="http://schemas.microsoft.com/office/word/2024/wordml/sdtformatlock" xmlns:w16se="http://schemas.microsoft.com/office/word/2015/wordml/symex" xmlns:wpg="http://schemas.microsoft.com/office/word/2010/wordprocessingGroup" xmlns:wpi="http://schemas.microsoft.com/office/word/2010/wordprocessingInk" xmlns:wne="http://schemas.microsoft.com/office/word/2006/wordml" xmlns:wps="http://schemas.microsoft.com/office/word/2010/wordprocessingShape" mc:Ignorable="w14 w15 w16se w16cid w16 w16cex w16sdtdh w16sdtfl w16du wp14">
+<w:numbering xmlns:wpc="http://schemas.microsoft.com/office/word/2010/wordprocessingCanvas" xmlns:cx="http://schemas.microsoft.com/office/drawing/2014/chartex" xmlns:cx1="http://schemas.microsoft.com/office/drawing/2015/9/8/chartex" xmlns:cx2="http://schemas.microsoft.com/office/drawing/2015/10/21/chartex" xmlns:cx3="http://schemas.microsoft.com/office/drawing/2016/5/9/chartex" xmlns:cx4="http://schemas.microsoft.com/office/drawing/2016/5/10/chartex" xmlns:cx5="http://schemas.microsoft.com/office/drawing/2016/5/11/chartex" xmlns:cx6="http://schemas.microsoft.com/office/drawing/2016/5/12/chartex" xmlns:cx7="http://schemas.microsoft.com/office/drawing/2016/5/13/chartex" xmlns:cx8="http://schemas.microsoft.com/office/drawing/2016/5/14/chartex" xmlns:mc="http://schemas.openxmlformats.org/markup-compatibility/2006" xmlns:aink="http://schemas.microsoft.com/office/drawing/2016/ink" xmlns:am3d="http://schemas.microsoft.com/office/drawing/2017/model3d" xmlns:o="urn:schemas-microsoft-com:office:office" xmlns:oel="http://schemas.microsoft.com/office/2019/extlst" xmlns:r="http://schemas.openxmlformats.org/officeDocument/2006/relationships" xmlns:m="http://schemas.openxmlformats.org/officeDocument/2006/math" xmlns:v="urn:schemas-microsoft-com:vml" xmlns:wp14="http://schemas.microsoft.com/office/word/2010/wordprocessingDrawing" xmlns:wp="http://schemas.openxmlformats.org/drawingml/2006/wordprocessingDrawing" xmlns:w10="urn:schemas-microsoft-com:office:word" xmlns:w="http://schemas.openxmlformats.org/wordprocessingml/2006/main" xmlns:w14="http://schemas.microsoft.com/office/word/2010/wordml" xmlns:w15="http://schemas.microsoft.com/office/word/2012/wordml" xmlns:w16cex="http://schemas.microsoft.com/office/word/2018/wordml/cex" xmlns:w16cid="http://schemas.microsoft.com/office/word/2016/wordml/cid" xmlns:w16="http://schemas.microsoft.com/office/word/2018/wordml" xmlns:w16du="http://schemas.microsoft.com/office/word/2023/wordml/word16du" xmlns:w16sdtdh="http://schemas.microsoft.com/office/word/2020/wordml/sdtdatahash" xmlns:w16sdtfl="http://schemas.microsoft.com/office/word/2024/wordml/sdtformatlock" xmlns:w16se="http://schemas.microsoft.com/office/word/2015/wordml/symex" xmlns:wpg="http://schemas.microsoft.com/office/word/2010/wordprocessingGroup" xmlns:wpi="http://schemas.microsoft.com/office/word/2010/wordprocessingInk" xmlns:wne="http://schemas.microsoft.com/office/word/2006/wordml" xmlns:wps="http://schemas.microsoft.com/office/word/2010/wordprocessingShape" mc:Ignorable="w14 w15 w16se w16cid w16 w16cex w16sdtdh w16sdtfl w16du wp14">
   <w:abstractNum w:abstractNumId="0" w15:restartNumberingAfterBreak="0">
     <w:nsid w:val="02077C83"/>
     <w:multiLevelType w:val="hybridMultilevel"/>
@@ -6087,6 +6090,7 @@
   <w:style w:type="character" w:default="1" w:styleId="DefaultParagraphFont">
     <w:name w:val="Default Paragraph Font"/>
     <w:uiPriority w:val="1"/>
+    <w:semiHidden/>
     <w:unhideWhenUsed/>
   </w:style>
   <w:style w:type="table" w:default="1" w:styleId="TableNormal">

</xml_diff>